<commit_message>
Add Postman API testing section to Spring Boot and Vue reference guides
</commit_message>
<xml_diff>
--- a/Spring_Boot_Vue_Lab_Exam_Complete_Guide.docx
+++ b/Spring_Boot_Vue_Lab_Exam_Complete_Guide.docx
@@ -706,6 +706,1660 @@
               <w:t xml:space="preserve">    }</w:t>
               <w:br/>
               <w:t>}</w:t>
+            </w:r>
+          </w:p>
+        </w:tc>
+      </w:tr>
+    </w:tbl>
+    <w:p>
+      <w:pPr>
+        <w:spacing w:before="0" w:after="120"/>
+      </w:pPr>
+    </w:p>
+    <w:p>
+      <w:pPr>
+        <w:pStyle w:val="Heading1"/>
+        <w:spacing w:before="280" w:after="120"/>
+      </w:pPr>
+      <w:r>
+        <w:t>POSTMAN API TESTING</w:t>
+      </w:r>
+    </w:p>
+    <w:p>
+      <w:pPr>
+        <w:pStyle w:val="Heading2"/>
+        <w:spacing w:before="200" w:after="80"/>
+      </w:pPr>
+      <w:r>
+        <w:t>Endpoints Overview</w:t>
+      </w:r>
+    </w:p>
+    <w:tbl>
+      <w:tblPr>
+        <w:tblW w:type="auto" w:w="0"/>
+        <w:tblLayout w:type="fixed"/>
+        <w:tblLook w:firstColumn="1" w:firstRow="1" w:lastColumn="0" w:lastRow="0" w:noHBand="0" w:noVBand="1" w:val="04A0"/>
+      </w:tblPr>
+      <w:tblGrid>
+        <w:gridCol w:w="1728"/>
+        <w:gridCol w:w="1152"/>
+        <w:gridCol w:w="3168"/>
+        <w:gridCol w:w="1584"/>
+        <w:gridCol w:w="2448"/>
+      </w:tblGrid>
+      <w:tr>
+        <w:tc>
+          <w:tcPr>
+            <w:tcW w:type="dxa" w:w="1728"/>
+            <w:shd w:fill="E2E8F0"/>
+          </w:tcPr>
+          <w:p>
+            <w:pPr>
+              <w:spacing w:before="40" w:after="40" w:line="252" w:lineRule="auto"/>
+            </w:pPr>
+            <w:r>
+              <w:rPr>
+                <w:rFonts w:ascii="Segoe UI" w:hAnsi="Segoe UI"/>
+                <w:b/>
+                <w:sz w:val="17"/>
+              </w:rPr>
+              <w:t>Operation</w:t>
+            </w:r>
+          </w:p>
+        </w:tc>
+        <w:tc>
+          <w:tcPr>
+            <w:tcW w:type="dxa" w:w="1152"/>
+            <w:shd w:fill="E2E8F0"/>
+          </w:tcPr>
+          <w:p>
+            <w:pPr>
+              <w:spacing w:before="40" w:after="40" w:line="252" w:lineRule="auto"/>
+            </w:pPr>
+            <w:r>
+              <w:rPr>
+                <w:rFonts w:ascii="Segoe UI" w:hAnsi="Segoe UI"/>
+                <w:b/>
+                <w:sz w:val="17"/>
+              </w:rPr>
+              <w:t>Method</w:t>
+            </w:r>
+          </w:p>
+        </w:tc>
+        <w:tc>
+          <w:tcPr>
+            <w:tcW w:type="dxa" w:w="3168"/>
+            <w:shd w:fill="E2E8F0"/>
+          </w:tcPr>
+          <w:p>
+            <w:pPr>
+              <w:spacing w:before="40" w:after="40" w:line="252" w:lineRule="auto"/>
+            </w:pPr>
+            <w:r>
+              <w:rPr>
+                <w:rFonts w:ascii="Segoe UI" w:hAnsi="Segoe UI"/>
+                <w:b/>
+                <w:sz w:val="17"/>
+              </w:rPr>
+              <w:t>URL</w:t>
+            </w:r>
+          </w:p>
+        </w:tc>
+        <w:tc>
+          <w:tcPr>
+            <w:tcW w:type="dxa" w:w="1584"/>
+            <w:shd w:fill="E2E8F0"/>
+          </w:tcPr>
+          <w:p>
+            <w:pPr>
+              <w:spacing w:before="40" w:after="40" w:line="252" w:lineRule="auto"/>
+            </w:pPr>
+            <w:r>
+              <w:rPr>
+                <w:rFonts w:ascii="Segoe UI" w:hAnsi="Segoe UI"/>
+                <w:b/>
+                <w:sz w:val="17"/>
+              </w:rPr>
+              <w:t>Request Body</w:t>
+            </w:r>
+          </w:p>
+        </w:tc>
+        <w:tc>
+          <w:tcPr>
+            <w:tcW w:type="dxa" w:w="2448"/>
+            <w:shd w:fill="E2E8F0"/>
+          </w:tcPr>
+          <w:p>
+            <w:pPr>
+              <w:spacing w:before="40" w:after="40" w:line="252" w:lineRule="auto"/>
+            </w:pPr>
+            <w:r>
+              <w:rPr>
+                <w:rFonts w:ascii="Segoe UI" w:hAnsi="Segoe UI"/>
+                <w:b/>
+                <w:sz w:val="17"/>
+              </w:rPr>
+              <w:t>Expected Response</w:t>
+            </w:r>
+          </w:p>
+        </w:tc>
+      </w:tr>
+      <w:tr>
+        <w:tc>
+          <w:tcPr>
+            <w:tcW w:type="dxa" w:w="1728"/>
+            <w:shd w:fill="F8FAFC"/>
+            <w:tcBorders>
+              <w:top w:val="single" w:sz="4" w:space="0" w:color="E2E8F0"/>
+              <w:bottom w:val="single" w:sz="4" w:space="0" w:color="E2E8F0"/>
+            </w:tcBorders>
+          </w:tcPr>
+          <w:p>
+            <w:pPr>
+              <w:spacing w:before="40" w:after="40" w:line="252" w:lineRule="auto"/>
+            </w:pPr>
+            <w:r>
+              <w:rPr>
+                <w:rFonts w:ascii="Segoe UI" w:hAnsi="Segoe UI"/>
+                <w:sz w:val="16"/>
+              </w:rPr>
+              <w:t>Create Product</w:t>
+            </w:r>
+          </w:p>
+        </w:tc>
+        <w:tc>
+          <w:tcPr>
+            <w:tcW w:type="dxa" w:w="1152"/>
+            <w:shd w:fill="F8FAFC"/>
+            <w:tcBorders>
+              <w:top w:val="single" w:sz="4" w:space="0" w:color="E2E8F0"/>
+              <w:bottom w:val="single" w:sz="4" w:space="0" w:color="E2E8F0"/>
+            </w:tcBorders>
+          </w:tcPr>
+          <w:p>
+            <w:pPr>
+              <w:spacing w:before="40" w:after="40" w:line="252" w:lineRule="auto"/>
+            </w:pPr>
+            <w:r>
+              <w:rPr>
+                <w:rFonts w:ascii="Consolas" w:hAnsi="Consolas"/>
+                <w:sz w:val="16"/>
+              </w:rPr>
+              <w:t>POST</w:t>
+            </w:r>
+          </w:p>
+        </w:tc>
+        <w:tc>
+          <w:tcPr>
+            <w:tcW w:type="dxa" w:w="3168"/>
+            <w:shd w:fill="F8FAFC"/>
+            <w:tcBorders>
+              <w:top w:val="single" w:sz="4" w:space="0" w:color="E2E8F0"/>
+              <w:bottom w:val="single" w:sz="4" w:space="0" w:color="E2E8F0"/>
+            </w:tcBorders>
+          </w:tcPr>
+          <w:p>
+            <w:pPr>
+              <w:spacing w:before="40" w:after="40" w:line="252" w:lineRule="auto"/>
+            </w:pPr>
+            <w:r>
+              <w:rPr>
+                <w:rFonts w:ascii="Consolas" w:hAnsi="Consolas"/>
+                <w:sz w:val="16"/>
+              </w:rPr>
+              <w:t>http://localhost:8080/api/products</w:t>
+            </w:r>
+          </w:p>
+        </w:tc>
+        <w:tc>
+          <w:tcPr>
+            <w:tcW w:type="dxa" w:w="1584"/>
+            <w:shd w:fill="F8FAFC"/>
+            <w:tcBorders>
+              <w:top w:val="single" w:sz="4" w:space="0" w:color="E2E8F0"/>
+              <w:bottom w:val="single" w:sz="4" w:space="0" w:color="E2E8F0"/>
+            </w:tcBorders>
+          </w:tcPr>
+          <w:p>
+            <w:pPr>
+              <w:spacing w:before="40" w:after="40" w:line="252" w:lineRule="auto"/>
+            </w:pPr>
+            <w:r>
+              <w:rPr>
+                <w:rFonts w:ascii="Segoe UI" w:hAnsi="Segoe UI"/>
+                <w:sz w:val="16"/>
+              </w:rPr>
+              <w:t>JSON object</w:t>
+            </w:r>
+          </w:p>
+        </w:tc>
+        <w:tc>
+          <w:tcPr>
+            <w:tcW w:type="dxa" w:w="2448"/>
+            <w:shd w:fill="F8FAFC"/>
+            <w:tcBorders>
+              <w:top w:val="single" w:sz="4" w:space="0" w:color="E2E8F0"/>
+              <w:bottom w:val="single" w:sz="4" w:space="0" w:color="E2E8F0"/>
+            </w:tcBorders>
+          </w:tcPr>
+          <w:p>
+            <w:pPr>
+              <w:spacing w:before="40" w:after="40" w:line="252" w:lineRule="auto"/>
+            </w:pPr>
+            <w:r>
+              <w:rPr>
+                <w:rFonts w:ascii="Segoe UI" w:hAnsi="Segoe UI"/>
+                <w:sz w:val="16"/>
+              </w:rPr>
+              <w:t>200 OK (created product with id)</w:t>
+            </w:r>
+          </w:p>
+        </w:tc>
+      </w:tr>
+      <w:tr>
+        <w:tc>
+          <w:tcPr>
+            <w:tcW w:type="dxa" w:w="1728"/>
+            <w:tcBorders>
+              <w:top w:val="single" w:sz="4" w:space="0" w:color="E2E8F0"/>
+              <w:bottom w:val="single" w:sz="4" w:space="0" w:color="E2E8F0"/>
+            </w:tcBorders>
+          </w:tcPr>
+          <w:p>
+            <w:pPr>
+              <w:spacing w:before="40" w:after="40" w:line="252" w:lineRule="auto"/>
+            </w:pPr>
+            <w:r>
+              <w:rPr>
+                <w:rFonts w:ascii="Segoe UI" w:hAnsi="Segoe UI"/>
+                <w:sz w:val="16"/>
+              </w:rPr>
+              <w:t>Get All Products</w:t>
+            </w:r>
+          </w:p>
+        </w:tc>
+        <w:tc>
+          <w:tcPr>
+            <w:tcW w:type="dxa" w:w="1152"/>
+            <w:tcBorders>
+              <w:top w:val="single" w:sz="4" w:space="0" w:color="E2E8F0"/>
+              <w:bottom w:val="single" w:sz="4" w:space="0" w:color="E2E8F0"/>
+            </w:tcBorders>
+          </w:tcPr>
+          <w:p>
+            <w:pPr>
+              <w:spacing w:before="40" w:after="40" w:line="252" w:lineRule="auto"/>
+            </w:pPr>
+            <w:r>
+              <w:rPr>
+                <w:rFonts w:ascii="Consolas" w:hAnsi="Consolas"/>
+                <w:sz w:val="16"/>
+              </w:rPr>
+              <w:t>GET</w:t>
+            </w:r>
+          </w:p>
+        </w:tc>
+        <w:tc>
+          <w:tcPr>
+            <w:tcW w:type="dxa" w:w="3168"/>
+            <w:tcBorders>
+              <w:top w:val="single" w:sz="4" w:space="0" w:color="E2E8F0"/>
+              <w:bottom w:val="single" w:sz="4" w:space="0" w:color="E2E8F0"/>
+            </w:tcBorders>
+          </w:tcPr>
+          <w:p>
+            <w:pPr>
+              <w:spacing w:before="40" w:after="40" w:line="252" w:lineRule="auto"/>
+            </w:pPr>
+            <w:r>
+              <w:rPr>
+                <w:rFonts w:ascii="Consolas" w:hAnsi="Consolas"/>
+                <w:sz w:val="16"/>
+              </w:rPr>
+              <w:t>http://localhost:8080/api/products</w:t>
+            </w:r>
+          </w:p>
+        </w:tc>
+        <w:tc>
+          <w:tcPr>
+            <w:tcW w:type="dxa" w:w="1584"/>
+            <w:tcBorders>
+              <w:top w:val="single" w:sz="4" w:space="0" w:color="E2E8F0"/>
+              <w:bottom w:val="single" w:sz="4" w:space="0" w:color="E2E8F0"/>
+            </w:tcBorders>
+          </w:tcPr>
+          <w:p>
+            <w:pPr>
+              <w:spacing w:before="40" w:after="40" w:line="252" w:lineRule="auto"/>
+            </w:pPr>
+            <w:r>
+              <w:rPr>
+                <w:rFonts w:ascii="Segoe UI" w:hAnsi="Segoe UI"/>
+                <w:sz w:val="16"/>
+              </w:rPr>
+              <w:t>None</w:t>
+            </w:r>
+          </w:p>
+        </w:tc>
+        <w:tc>
+          <w:tcPr>
+            <w:tcW w:type="dxa" w:w="2448"/>
+            <w:tcBorders>
+              <w:top w:val="single" w:sz="4" w:space="0" w:color="E2E8F0"/>
+              <w:bottom w:val="single" w:sz="4" w:space="0" w:color="E2E8F0"/>
+            </w:tcBorders>
+          </w:tcPr>
+          <w:p>
+            <w:pPr>
+              <w:spacing w:before="40" w:after="40" w:line="252" w:lineRule="auto"/>
+            </w:pPr>
+            <w:r>
+              <w:rPr>
+                <w:rFonts w:ascii="Segoe UI" w:hAnsi="Segoe UI"/>
+                <w:sz w:val="16"/>
+              </w:rPr>
+              <w:t>200 OK (JSON array of products)</w:t>
+            </w:r>
+          </w:p>
+        </w:tc>
+      </w:tr>
+      <w:tr>
+        <w:tc>
+          <w:tcPr>
+            <w:tcW w:type="dxa" w:w="1728"/>
+            <w:shd w:fill="F8FAFC"/>
+            <w:tcBorders>
+              <w:top w:val="single" w:sz="4" w:space="0" w:color="E2E8F0"/>
+              <w:bottom w:val="single" w:sz="4" w:space="0" w:color="E2E8F0"/>
+            </w:tcBorders>
+          </w:tcPr>
+          <w:p>
+            <w:pPr>
+              <w:spacing w:before="40" w:after="40" w:line="252" w:lineRule="auto"/>
+            </w:pPr>
+            <w:r>
+              <w:rPr>
+                <w:rFonts w:ascii="Segoe UI" w:hAnsi="Segoe UI"/>
+                <w:sz w:val="16"/>
+              </w:rPr>
+              <w:t>Get Product by ID</w:t>
+            </w:r>
+          </w:p>
+        </w:tc>
+        <w:tc>
+          <w:tcPr>
+            <w:tcW w:type="dxa" w:w="1152"/>
+            <w:shd w:fill="F8FAFC"/>
+            <w:tcBorders>
+              <w:top w:val="single" w:sz="4" w:space="0" w:color="E2E8F0"/>
+              <w:bottom w:val="single" w:sz="4" w:space="0" w:color="E2E8F0"/>
+            </w:tcBorders>
+          </w:tcPr>
+          <w:p>
+            <w:pPr>
+              <w:spacing w:before="40" w:after="40" w:line="252" w:lineRule="auto"/>
+            </w:pPr>
+            <w:r>
+              <w:rPr>
+                <w:rFonts w:ascii="Consolas" w:hAnsi="Consolas"/>
+                <w:sz w:val="16"/>
+              </w:rPr>
+              <w:t>GET</w:t>
+            </w:r>
+          </w:p>
+        </w:tc>
+        <w:tc>
+          <w:tcPr>
+            <w:tcW w:type="dxa" w:w="3168"/>
+            <w:shd w:fill="F8FAFC"/>
+            <w:tcBorders>
+              <w:top w:val="single" w:sz="4" w:space="0" w:color="E2E8F0"/>
+              <w:bottom w:val="single" w:sz="4" w:space="0" w:color="E2E8F0"/>
+            </w:tcBorders>
+          </w:tcPr>
+          <w:p>
+            <w:pPr>
+              <w:spacing w:before="40" w:after="40" w:line="252" w:lineRule="auto"/>
+            </w:pPr>
+            <w:r>
+              <w:rPr>
+                <w:rFonts w:ascii="Consolas" w:hAnsi="Consolas"/>
+                <w:sz w:val="16"/>
+              </w:rPr>
+              <w:t>http://localhost:8080/api/products/6acc5cc42577d09cacd3c23e</w:t>
+            </w:r>
+          </w:p>
+        </w:tc>
+        <w:tc>
+          <w:tcPr>
+            <w:tcW w:type="dxa" w:w="1584"/>
+            <w:shd w:fill="F8FAFC"/>
+            <w:tcBorders>
+              <w:top w:val="single" w:sz="4" w:space="0" w:color="E2E8F0"/>
+              <w:bottom w:val="single" w:sz="4" w:space="0" w:color="E2E8F0"/>
+            </w:tcBorders>
+          </w:tcPr>
+          <w:p>
+            <w:pPr>
+              <w:spacing w:before="40" w:after="40" w:line="252" w:lineRule="auto"/>
+            </w:pPr>
+            <w:r>
+              <w:rPr>
+                <w:rFonts w:ascii="Segoe UI" w:hAnsi="Segoe UI"/>
+                <w:sz w:val="16"/>
+              </w:rPr>
+              <w:t>None</w:t>
+            </w:r>
+          </w:p>
+        </w:tc>
+        <w:tc>
+          <w:tcPr>
+            <w:tcW w:type="dxa" w:w="2448"/>
+            <w:shd w:fill="F8FAFC"/>
+            <w:tcBorders>
+              <w:top w:val="single" w:sz="4" w:space="0" w:color="E2E8F0"/>
+              <w:bottom w:val="single" w:sz="4" w:space="0" w:color="E2E8F0"/>
+            </w:tcBorders>
+          </w:tcPr>
+          <w:p>
+            <w:pPr>
+              <w:spacing w:before="40" w:after="40" w:line="252" w:lineRule="auto"/>
+            </w:pPr>
+            <w:r>
+              <w:rPr>
+                <w:rFonts w:ascii="Segoe UI" w:hAnsi="Segoe UI"/>
+                <w:sz w:val="16"/>
+              </w:rPr>
+              <w:t>200 OK (product object or null)</w:t>
+            </w:r>
+          </w:p>
+        </w:tc>
+      </w:tr>
+      <w:tr>
+        <w:tc>
+          <w:tcPr>
+            <w:tcW w:type="dxa" w:w="1728"/>
+            <w:tcBorders>
+              <w:top w:val="single" w:sz="4" w:space="0" w:color="E2E8F0"/>
+              <w:bottom w:val="single" w:sz="4" w:space="0" w:color="E2E8F0"/>
+            </w:tcBorders>
+          </w:tcPr>
+          <w:p>
+            <w:pPr>
+              <w:spacing w:before="40" w:after="40" w:line="252" w:lineRule="auto"/>
+            </w:pPr>
+            <w:r>
+              <w:rPr>
+                <w:rFonts w:ascii="Segoe UI" w:hAnsi="Segoe UI"/>
+                <w:sz w:val="16"/>
+              </w:rPr>
+              <w:t>Update Product</w:t>
+            </w:r>
+          </w:p>
+        </w:tc>
+        <w:tc>
+          <w:tcPr>
+            <w:tcW w:type="dxa" w:w="1152"/>
+            <w:tcBorders>
+              <w:top w:val="single" w:sz="4" w:space="0" w:color="E2E8F0"/>
+              <w:bottom w:val="single" w:sz="4" w:space="0" w:color="E2E8F0"/>
+            </w:tcBorders>
+          </w:tcPr>
+          <w:p>
+            <w:pPr>
+              <w:spacing w:before="40" w:after="40" w:line="252" w:lineRule="auto"/>
+            </w:pPr>
+            <w:r>
+              <w:rPr>
+                <w:rFonts w:ascii="Consolas" w:hAnsi="Consolas"/>
+                <w:sz w:val="16"/>
+              </w:rPr>
+              <w:t>PUT</w:t>
+            </w:r>
+          </w:p>
+        </w:tc>
+        <w:tc>
+          <w:tcPr>
+            <w:tcW w:type="dxa" w:w="3168"/>
+            <w:tcBorders>
+              <w:top w:val="single" w:sz="4" w:space="0" w:color="E2E8F0"/>
+              <w:bottom w:val="single" w:sz="4" w:space="0" w:color="E2E8F0"/>
+            </w:tcBorders>
+          </w:tcPr>
+          <w:p>
+            <w:pPr>
+              <w:spacing w:before="40" w:after="40" w:line="252" w:lineRule="auto"/>
+            </w:pPr>
+            <w:r>
+              <w:rPr>
+                <w:rFonts w:ascii="Consolas" w:hAnsi="Consolas"/>
+                <w:sz w:val="16"/>
+              </w:rPr>
+              <w:t>http://localhost:8080/api/products/6acc5cc42577d09cacd3c23e</w:t>
+            </w:r>
+          </w:p>
+        </w:tc>
+        <w:tc>
+          <w:tcPr>
+            <w:tcW w:type="dxa" w:w="1584"/>
+            <w:tcBorders>
+              <w:top w:val="single" w:sz="4" w:space="0" w:color="E2E8F0"/>
+              <w:bottom w:val="single" w:sz="4" w:space="0" w:color="E2E8F0"/>
+            </w:tcBorders>
+          </w:tcPr>
+          <w:p>
+            <w:pPr>
+              <w:spacing w:before="40" w:after="40" w:line="252" w:lineRule="auto"/>
+            </w:pPr>
+            <w:r>
+              <w:rPr>
+                <w:rFonts w:ascii="Segoe UI" w:hAnsi="Segoe UI"/>
+                <w:sz w:val="16"/>
+              </w:rPr>
+              <w:t>JSON object</w:t>
+            </w:r>
+          </w:p>
+        </w:tc>
+        <w:tc>
+          <w:tcPr>
+            <w:tcW w:type="dxa" w:w="2448"/>
+            <w:tcBorders>
+              <w:top w:val="single" w:sz="4" w:space="0" w:color="E2E8F0"/>
+              <w:bottom w:val="single" w:sz="4" w:space="0" w:color="E2E8F0"/>
+            </w:tcBorders>
+          </w:tcPr>
+          <w:p>
+            <w:pPr>
+              <w:spacing w:before="40" w:after="40" w:line="252" w:lineRule="auto"/>
+            </w:pPr>
+            <w:r>
+              <w:rPr>
+                <w:rFonts w:ascii="Segoe UI" w:hAnsi="Segoe UI"/>
+                <w:sz w:val="16"/>
+              </w:rPr>
+              <w:t>200 OK (updated product object or null)</w:t>
+            </w:r>
+          </w:p>
+        </w:tc>
+      </w:tr>
+      <w:tr>
+        <w:tc>
+          <w:tcPr>
+            <w:tcW w:type="dxa" w:w="1728"/>
+            <w:shd w:fill="F8FAFC"/>
+            <w:tcBorders>
+              <w:top w:val="single" w:sz="4" w:space="0" w:color="E2E8F0"/>
+              <w:bottom w:val="single" w:sz="4" w:space="0" w:color="E2E8F0"/>
+            </w:tcBorders>
+          </w:tcPr>
+          <w:p>
+            <w:pPr>
+              <w:spacing w:before="40" w:after="40" w:line="252" w:lineRule="auto"/>
+            </w:pPr>
+            <w:r>
+              <w:rPr>
+                <w:rFonts w:ascii="Segoe UI" w:hAnsi="Segoe UI"/>
+                <w:sz w:val="16"/>
+              </w:rPr>
+              <w:t>Delete Product</w:t>
+            </w:r>
+          </w:p>
+        </w:tc>
+        <w:tc>
+          <w:tcPr>
+            <w:tcW w:type="dxa" w:w="1152"/>
+            <w:shd w:fill="F8FAFC"/>
+            <w:tcBorders>
+              <w:top w:val="single" w:sz="4" w:space="0" w:color="E2E8F0"/>
+              <w:bottom w:val="single" w:sz="4" w:space="0" w:color="E2E8F0"/>
+            </w:tcBorders>
+          </w:tcPr>
+          <w:p>
+            <w:pPr>
+              <w:spacing w:before="40" w:after="40" w:line="252" w:lineRule="auto"/>
+            </w:pPr>
+            <w:r>
+              <w:rPr>
+                <w:rFonts w:ascii="Consolas" w:hAnsi="Consolas"/>
+                <w:sz w:val="16"/>
+              </w:rPr>
+              <w:t>DELETE</w:t>
+            </w:r>
+          </w:p>
+        </w:tc>
+        <w:tc>
+          <w:tcPr>
+            <w:tcW w:type="dxa" w:w="3168"/>
+            <w:shd w:fill="F8FAFC"/>
+            <w:tcBorders>
+              <w:top w:val="single" w:sz="4" w:space="0" w:color="E2E8F0"/>
+              <w:bottom w:val="single" w:sz="4" w:space="0" w:color="E2E8F0"/>
+            </w:tcBorders>
+          </w:tcPr>
+          <w:p>
+            <w:pPr>
+              <w:spacing w:before="40" w:after="40" w:line="252" w:lineRule="auto"/>
+            </w:pPr>
+            <w:r>
+              <w:rPr>
+                <w:rFonts w:ascii="Consolas" w:hAnsi="Consolas"/>
+                <w:sz w:val="16"/>
+              </w:rPr>
+              <w:t>http://localhost:8080/api/products/6acc5cc42577d09cacd3c23e</w:t>
+            </w:r>
+          </w:p>
+        </w:tc>
+        <w:tc>
+          <w:tcPr>
+            <w:tcW w:type="dxa" w:w="1584"/>
+            <w:shd w:fill="F8FAFC"/>
+            <w:tcBorders>
+              <w:top w:val="single" w:sz="4" w:space="0" w:color="E2E8F0"/>
+              <w:bottom w:val="single" w:sz="4" w:space="0" w:color="E2E8F0"/>
+            </w:tcBorders>
+          </w:tcPr>
+          <w:p>
+            <w:pPr>
+              <w:spacing w:before="40" w:after="40" w:line="252" w:lineRule="auto"/>
+            </w:pPr>
+            <w:r>
+              <w:rPr>
+                <w:rFonts w:ascii="Segoe UI" w:hAnsi="Segoe UI"/>
+                <w:sz w:val="16"/>
+              </w:rPr>
+              <w:t>None</w:t>
+            </w:r>
+          </w:p>
+        </w:tc>
+        <w:tc>
+          <w:tcPr>
+            <w:tcW w:type="dxa" w:w="2448"/>
+            <w:shd w:fill="F8FAFC"/>
+            <w:tcBorders>
+              <w:top w:val="single" w:sz="4" w:space="0" w:color="E2E8F0"/>
+              <w:bottom w:val="single" w:sz="4" w:space="0" w:color="E2E8F0"/>
+            </w:tcBorders>
+          </w:tcPr>
+          <w:p>
+            <w:pPr>
+              <w:spacing w:before="40" w:after="40" w:line="252" w:lineRule="auto"/>
+            </w:pPr>
+            <w:r>
+              <w:rPr>
+                <w:rFonts w:ascii="Segoe UI" w:hAnsi="Segoe UI"/>
+                <w:sz w:val="16"/>
+              </w:rPr>
+              <w:t>200 OK (void)</w:t>
+            </w:r>
+          </w:p>
+        </w:tc>
+      </w:tr>
+      <w:tr>
+        <w:tc>
+          <w:tcPr>
+            <w:tcW w:type="dxa" w:w="1728"/>
+            <w:tcBorders>
+              <w:top w:val="single" w:sz="4" w:space="0" w:color="E2E8F0"/>
+              <w:bottom w:val="single" w:sz="4" w:space="0" w:color="E2E8F0"/>
+            </w:tcBorders>
+          </w:tcPr>
+          <w:p>
+            <w:pPr>
+              <w:spacing w:before="40" w:after="40" w:line="252" w:lineRule="auto"/>
+            </w:pPr>
+            <w:r>
+              <w:rPr>
+                <w:rFonts w:ascii="Segoe UI" w:hAnsi="Segoe UI"/>
+                <w:sz w:val="16"/>
+              </w:rPr>
+              <w:t>Search Products</w:t>
+            </w:r>
+          </w:p>
+        </w:tc>
+        <w:tc>
+          <w:tcPr>
+            <w:tcW w:type="dxa" w:w="1152"/>
+            <w:tcBorders>
+              <w:top w:val="single" w:sz="4" w:space="0" w:color="E2E8F0"/>
+              <w:bottom w:val="single" w:sz="4" w:space="0" w:color="E2E8F0"/>
+            </w:tcBorders>
+          </w:tcPr>
+          <w:p>
+            <w:pPr>
+              <w:spacing w:before="40" w:after="40" w:line="252" w:lineRule="auto"/>
+            </w:pPr>
+            <w:r>
+              <w:rPr>
+                <w:rFonts w:ascii="Consolas" w:hAnsi="Consolas"/>
+                <w:sz w:val="16"/>
+              </w:rPr>
+              <w:t>GET</w:t>
+            </w:r>
+          </w:p>
+        </w:tc>
+        <w:tc>
+          <w:tcPr>
+            <w:tcW w:type="dxa" w:w="3168"/>
+            <w:tcBorders>
+              <w:top w:val="single" w:sz="4" w:space="0" w:color="E2E8F0"/>
+              <w:bottom w:val="single" w:sz="4" w:space="0" w:color="E2E8F0"/>
+            </w:tcBorders>
+          </w:tcPr>
+          <w:p>
+            <w:pPr>
+              <w:spacing w:before="40" w:after="40" w:line="252" w:lineRule="auto"/>
+            </w:pPr>
+            <w:r>
+              <w:rPr>
+                <w:rFonts w:ascii="Consolas" w:hAnsi="Consolas"/>
+                <w:sz w:val="16"/>
+              </w:rPr>
+              <w:t>http://localhost:8080/api/products/search?name=Headphones</w:t>
+            </w:r>
+          </w:p>
+        </w:tc>
+        <w:tc>
+          <w:tcPr>
+            <w:tcW w:type="dxa" w:w="1584"/>
+            <w:tcBorders>
+              <w:top w:val="single" w:sz="4" w:space="0" w:color="E2E8F0"/>
+              <w:bottom w:val="single" w:sz="4" w:space="0" w:color="E2E8F0"/>
+            </w:tcBorders>
+          </w:tcPr>
+          <w:p>
+            <w:pPr>
+              <w:spacing w:before="40" w:after="40" w:line="252" w:lineRule="auto"/>
+            </w:pPr>
+            <w:r>
+              <w:rPr>
+                <w:rFonts w:ascii="Segoe UI" w:hAnsi="Segoe UI"/>
+                <w:sz w:val="16"/>
+              </w:rPr>
+              <w:t>None</w:t>
+            </w:r>
+          </w:p>
+        </w:tc>
+        <w:tc>
+          <w:tcPr>
+            <w:tcW w:type="dxa" w:w="2448"/>
+            <w:tcBorders>
+              <w:top w:val="single" w:sz="4" w:space="0" w:color="E2E8F0"/>
+              <w:bottom w:val="single" w:sz="4" w:space="0" w:color="E2E8F0"/>
+            </w:tcBorders>
+          </w:tcPr>
+          <w:p>
+            <w:pPr>
+              <w:spacing w:before="40" w:after="40" w:line="252" w:lineRule="auto"/>
+            </w:pPr>
+            <w:r>
+              <w:rPr>
+                <w:rFonts w:ascii="Segoe UI" w:hAnsi="Segoe UI"/>
+                <w:sz w:val="16"/>
+              </w:rPr>
+              <w:t>200 OK (JSON array of matching products)</w:t>
+            </w:r>
+          </w:p>
+        </w:tc>
+      </w:tr>
+    </w:tbl>
+    <w:p>
+      <w:pPr>
+        <w:spacing w:before="0" w:after="160"/>
+      </w:pPr>
+    </w:p>
+    <w:p>
+      <w:pPr>
+        <w:pStyle w:val="Heading2"/>
+        <w:spacing w:before="200" w:after="80"/>
+      </w:pPr>
+      <w:r>
+        <w:t>Create Product</w:t>
+      </w:r>
+    </w:p>
+    <w:p>
+      <w:pPr>
+        <w:spacing w:before="0" w:after="40"/>
+      </w:pPr>
+      <w:r>
+        <w:rPr>
+          <w:b/>
+        </w:rPr>
+        <w:t xml:space="preserve">Method: </w:t>
+      </w:r>
+      <w:r>
+        <w:rPr>
+          <w:rFonts w:ascii="Consolas" w:hAnsi="Consolas"/>
+          <w:b/>
+        </w:rPr>
+        <w:t>POST</w:t>
+        <w:br/>
+      </w:r>
+      <w:r>
+        <w:rPr>
+          <w:b/>
+        </w:rPr>
+        <w:t xml:space="preserve">URL: </w:t>
+      </w:r>
+      <w:r>
+        <w:rPr>
+          <w:rFonts w:ascii="Consolas" w:hAnsi="Consolas"/>
+        </w:rPr>
+        <w:t>http://localhost:8080/api/products</w:t>
+        <w:br/>
+      </w:r>
+      <w:r>
+        <w:rPr>
+          <w:b/>
+        </w:rPr>
+        <w:t xml:space="preserve">Headers: </w:t>
+      </w:r>
+      <w:r>
+        <w:rPr>
+          <w:rFonts w:ascii="Consolas" w:hAnsi="Consolas"/>
+        </w:rPr>
+        <w:t>Content-Type: application/json</w:t>
+        <w:br/>
+      </w:r>
+      <w:r>
+        <w:rPr>
+          <w:b/>
+        </w:rPr>
+        <w:t>Body → raw → JSON</w:t>
+      </w:r>
+    </w:p>
+    <w:tbl>
+      <w:tblPr>
+        <w:tblW w:type="auto" w:w="0"/>
+        <w:tblLayout w:type="fixed"/>
+        <w:tblLook w:firstColumn="1" w:firstRow="1" w:lastColumn="0" w:lastRow="0" w:noHBand="0" w:noVBand="1" w:val="04A0"/>
+      </w:tblPr>
+      <w:tblGrid>
+        <w:gridCol w:w="10080"/>
+      </w:tblGrid>
+      <w:tr>
+        <w:tc>
+          <w:tcPr>
+            <w:tcW w:type="dxa" w:w="10080"/>
+            <w:shd w:fill="F6F8FA"/>
+            <w:tcBorders>
+              <w:top w:val="single" w:sz="4" w:space="0" w:color="D0D7DE"/>
+              <w:left w:val="single" w:sz="4" w:space="0" w:color="D0D7DE"/>
+              <w:bottom w:val="single" w:sz="4" w:space="0" w:color="D0D7DE"/>
+              <w:right w:val="single" w:sz="4" w:space="0" w:color="D0D7DE"/>
+            </w:tcBorders>
+            <w:tcMar>
+              <w:top w:w="120" w:type="dxa"/>
+              <w:left w:w="180" w:type="dxa"/>
+              <w:bottom w:w="120" w:type="dxa"/>
+              <w:right w:w="180" w:type="dxa"/>
+            </w:tcMar>
+          </w:tcPr>
+          <w:p>
+            <w:pPr>
+              <w:spacing w:before="0" w:after="0" w:line="252" w:lineRule="auto"/>
+            </w:pPr>
+            <w:r>
+              <w:rPr>
+                <w:rFonts w:ascii="Consolas" w:hAnsi="Consolas"/>
+                <w:color w:val="24292F"/>
+                <w:sz w:val="17"/>
+              </w:rPr>
+              <w:t>{</w:t>
+              <w:br/>
+              <w:t xml:space="preserve">  "name": "Headphones",</w:t>
+              <w:br/>
+              <w:t xml:space="preserve">  "price": 1999.0,</w:t>
+              <w:br/>
+              <w:t xml:space="preserve">  "stock": 10</w:t>
+              <w:br/>
+              <w:t>}</w:t>
+            </w:r>
+          </w:p>
+        </w:tc>
+      </w:tr>
+    </w:tbl>
+    <w:p>
+      <w:pPr>
+        <w:spacing w:before="0" w:after="120"/>
+      </w:pPr>
+    </w:p>
+    <w:p>
+      <w:pPr>
+        <w:spacing w:before="40" w:after="40"/>
+      </w:pPr>
+      <w:r>
+        <w:rPr>
+          <w:sz w:val="19"/>
+        </w:rPr>
+        <w:t>Expected Response:</w:t>
+        <w:br/>
+        <w:t>200 OK with created product object including generated MongoDB id:</w:t>
+      </w:r>
+    </w:p>
+    <w:tbl>
+      <w:tblPr>
+        <w:tblW w:type="auto" w:w="0"/>
+        <w:tblLayout w:type="fixed"/>
+        <w:tblLook w:firstColumn="1" w:firstRow="1" w:lastColumn="0" w:lastRow="0" w:noHBand="0" w:noVBand="1" w:val="04A0"/>
+      </w:tblPr>
+      <w:tblGrid>
+        <w:gridCol w:w="10080"/>
+      </w:tblGrid>
+      <w:tr>
+        <w:tc>
+          <w:tcPr>
+            <w:tcW w:type="dxa" w:w="10080"/>
+            <w:shd w:fill="F6F8FA"/>
+            <w:tcBorders>
+              <w:top w:val="single" w:sz="4" w:space="0" w:color="D0D7DE"/>
+              <w:left w:val="single" w:sz="4" w:space="0" w:color="D0D7DE"/>
+              <w:bottom w:val="single" w:sz="4" w:space="0" w:color="D0D7DE"/>
+              <w:right w:val="single" w:sz="4" w:space="0" w:color="D0D7DE"/>
+            </w:tcBorders>
+            <w:tcMar>
+              <w:top w:w="120" w:type="dxa"/>
+              <w:left w:w="180" w:type="dxa"/>
+              <w:bottom w:w="120" w:type="dxa"/>
+              <w:right w:w="180" w:type="dxa"/>
+            </w:tcMar>
+          </w:tcPr>
+          <w:p>
+            <w:pPr>
+              <w:spacing w:before="0" w:after="0" w:line="252" w:lineRule="auto"/>
+            </w:pPr>
+            <w:r>
+              <w:rPr>
+                <w:rFonts w:ascii="Consolas" w:hAnsi="Consolas"/>
+                <w:color w:val="24292F"/>
+                <w:sz w:val="17"/>
+              </w:rPr>
+              <w:t>{</w:t>
+              <w:br/>
+              <w:t xml:space="preserve">  "id": "6acc5cc42577d09cacd3c23e",</w:t>
+              <w:br/>
+              <w:t xml:space="preserve">  "name": "Headphones",</w:t>
+              <w:br/>
+              <w:t xml:space="preserve">  "price": 1999.0,</w:t>
+              <w:br/>
+              <w:t xml:space="preserve">  "stock": 10</w:t>
+              <w:br/>
+              <w:t>}</w:t>
+            </w:r>
+          </w:p>
+        </w:tc>
+      </w:tr>
+    </w:tbl>
+    <w:p>
+      <w:pPr>
+        <w:spacing w:before="0" w:after="120"/>
+      </w:pPr>
+    </w:p>
+    <w:p>
+      <w:pPr>
+        <w:pStyle w:val="Heading2"/>
+        <w:spacing w:before="200" w:after="80"/>
+      </w:pPr>
+      <w:r>
+        <w:t>Get All Products</w:t>
+      </w:r>
+    </w:p>
+    <w:p>
+      <w:pPr>
+        <w:spacing w:before="0" w:after="40"/>
+      </w:pPr>
+      <w:r>
+        <w:rPr>
+          <w:b/>
+        </w:rPr>
+        <w:t xml:space="preserve">Method: </w:t>
+      </w:r>
+      <w:r>
+        <w:rPr>
+          <w:rFonts w:ascii="Consolas" w:hAnsi="Consolas"/>
+          <w:b/>
+        </w:rPr>
+        <w:t>GET</w:t>
+        <w:br/>
+      </w:r>
+      <w:r>
+        <w:rPr>
+          <w:b/>
+        </w:rPr>
+        <w:t xml:space="preserve">URL: </w:t>
+      </w:r>
+      <w:r>
+        <w:rPr>
+          <w:rFonts w:ascii="Consolas" w:hAnsi="Consolas"/>
+        </w:rPr>
+        <w:t>http://localhost:8080/api/products</w:t>
+        <w:br/>
+      </w:r>
+      <w:r>
+        <w:rPr>
+          <w:b/>
+        </w:rPr>
+        <w:t xml:space="preserve">Headers: </w:t>
+      </w:r>
+      <w:r>
+        <w:rPr>
+          <w:rFonts w:ascii="Consolas" w:hAnsi="Consolas"/>
+        </w:rPr>
+        <w:t>Accept: application/json</w:t>
+        <w:br/>
+      </w:r>
+      <w:r>
+        <w:rPr>
+          <w:b/>
+        </w:rPr>
+        <w:t>Body: None.</w:t>
+      </w:r>
+    </w:p>
+    <w:p>
+      <w:pPr>
+        <w:spacing w:before="40" w:after="40"/>
+      </w:pPr>
+      <w:r>
+        <w:rPr>
+          <w:sz w:val="19"/>
+        </w:rPr>
+        <w:t>Expected Response:</w:t>
+        <w:br/>
+        <w:t>200 OK with JSON array of all stored products:</w:t>
+      </w:r>
+    </w:p>
+    <w:tbl>
+      <w:tblPr>
+        <w:tblW w:type="auto" w:w="0"/>
+        <w:tblLayout w:type="fixed"/>
+        <w:tblLook w:firstColumn="1" w:firstRow="1" w:lastColumn="0" w:lastRow="0" w:noHBand="0" w:noVBand="1" w:val="04A0"/>
+      </w:tblPr>
+      <w:tblGrid>
+        <w:gridCol w:w="10080"/>
+      </w:tblGrid>
+      <w:tr>
+        <w:tc>
+          <w:tcPr>
+            <w:tcW w:type="dxa" w:w="10080"/>
+            <w:shd w:fill="F6F8FA"/>
+            <w:tcBorders>
+              <w:top w:val="single" w:sz="4" w:space="0" w:color="D0D7DE"/>
+              <w:left w:val="single" w:sz="4" w:space="0" w:color="D0D7DE"/>
+              <w:bottom w:val="single" w:sz="4" w:space="0" w:color="D0D7DE"/>
+              <w:right w:val="single" w:sz="4" w:space="0" w:color="D0D7DE"/>
+            </w:tcBorders>
+            <w:tcMar>
+              <w:top w:w="120" w:type="dxa"/>
+              <w:left w:w="180" w:type="dxa"/>
+              <w:bottom w:w="120" w:type="dxa"/>
+              <w:right w:w="180" w:type="dxa"/>
+            </w:tcMar>
+          </w:tcPr>
+          <w:p>
+            <w:pPr>
+              <w:spacing w:before="0" w:after="0" w:line="252" w:lineRule="auto"/>
+            </w:pPr>
+            <w:r>
+              <w:rPr>
+                <w:rFonts w:ascii="Consolas" w:hAnsi="Consolas"/>
+                <w:color w:val="24292F"/>
+                <w:sz w:val="17"/>
+              </w:rPr>
+              <w:t>[</w:t>
+              <w:br/>
+              <w:t xml:space="preserve">  {</w:t>
+              <w:br/>
+              <w:t xml:space="preserve">    "id": "6acc5cc42577d09cacd3c23e",</w:t>
+              <w:br/>
+              <w:t xml:space="preserve">    "name": "Headphones",</w:t>
+              <w:br/>
+              <w:t xml:space="preserve">    "price": 1999.0,</w:t>
+              <w:br/>
+              <w:t xml:space="preserve">    "stock": 10</w:t>
+              <w:br/>
+              <w:t xml:space="preserve">  }</w:t>
+              <w:br/>
+              <w:t>]</w:t>
+            </w:r>
+          </w:p>
+        </w:tc>
+      </w:tr>
+    </w:tbl>
+    <w:p>
+      <w:pPr>
+        <w:spacing w:before="0" w:after="120"/>
+      </w:pPr>
+    </w:p>
+    <w:p>
+      <w:pPr>
+        <w:pStyle w:val="Heading2"/>
+        <w:spacing w:before="200" w:after="80"/>
+      </w:pPr>
+      <w:r>
+        <w:t>Get Product by ID</w:t>
+      </w:r>
+    </w:p>
+    <w:p>
+      <w:pPr>
+        <w:spacing w:before="0" w:after="40"/>
+      </w:pPr>
+      <w:r>
+        <w:rPr>
+          <w:b/>
+        </w:rPr>
+        <w:t xml:space="preserve">Method: </w:t>
+      </w:r>
+      <w:r>
+        <w:rPr>
+          <w:rFonts w:ascii="Consolas" w:hAnsi="Consolas"/>
+          <w:b/>
+        </w:rPr>
+        <w:t>GET</w:t>
+        <w:br/>
+      </w:r>
+      <w:r>
+        <w:rPr>
+          <w:b/>
+        </w:rPr>
+        <w:t xml:space="preserve">URL: </w:t>
+      </w:r>
+      <w:r>
+        <w:rPr>
+          <w:rFonts w:ascii="Consolas" w:hAnsi="Consolas"/>
+        </w:rPr>
+        <w:t>http://localhost:8080/api/products/6acc5cc42577d09cacd3c23e</w:t>
+        <w:br/>
+      </w:r>
+      <w:r>
+        <w:rPr>
+          <w:b/>
+        </w:rPr>
+        <w:t xml:space="preserve">Headers: </w:t>
+      </w:r>
+      <w:r>
+        <w:rPr>
+          <w:rFonts w:ascii="Consolas" w:hAnsi="Consolas"/>
+        </w:rPr>
+        <w:t>Accept: application/json</w:t>
+        <w:br/>
+      </w:r>
+      <w:r>
+        <w:rPr>
+          <w:sz w:val="19"/>
+        </w:rPr>
+        <w:t>Path Parameter: id = 6acc5cc42577d09cacd3c23e (Use actual ID returned by POST or GET; never use literal curly braces).</w:t>
+        <w:br/>
+      </w:r>
+      <w:r>
+        <w:rPr>
+          <w:b/>
+        </w:rPr>
+        <w:t>Body: None.</w:t>
+      </w:r>
+    </w:p>
+    <w:p>
+      <w:pPr>
+        <w:spacing w:before="40" w:after="40"/>
+      </w:pPr>
+      <w:r>
+        <w:rPr>
+          <w:sz w:val="19"/>
+        </w:rPr>
+        <w:t>Expected Response:</w:t>
+        <w:br/>
+        <w:t>200 OK with product object (or null if not found):</w:t>
+      </w:r>
+    </w:p>
+    <w:tbl>
+      <w:tblPr>
+        <w:tblW w:type="auto" w:w="0"/>
+        <w:tblLayout w:type="fixed"/>
+        <w:tblLook w:firstColumn="1" w:firstRow="1" w:lastColumn="0" w:lastRow="0" w:noHBand="0" w:noVBand="1" w:val="04A0"/>
+      </w:tblPr>
+      <w:tblGrid>
+        <w:gridCol w:w="10080"/>
+      </w:tblGrid>
+      <w:tr>
+        <w:tc>
+          <w:tcPr>
+            <w:tcW w:type="dxa" w:w="10080"/>
+            <w:shd w:fill="F6F8FA"/>
+            <w:tcBorders>
+              <w:top w:val="single" w:sz="4" w:space="0" w:color="D0D7DE"/>
+              <w:left w:val="single" w:sz="4" w:space="0" w:color="D0D7DE"/>
+              <w:bottom w:val="single" w:sz="4" w:space="0" w:color="D0D7DE"/>
+              <w:right w:val="single" w:sz="4" w:space="0" w:color="D0D7DE"/>
+            </w:tcBorders>
+            <w:tcMar>
+              <w:top w:w="120" w:type="dxa"/>
+              <w:left w:w="180" w:type="dxa"/>
+              <w:bottom w:w="120" w:type="dxa"/>
+              <w:right w:w="180" w:type="dxa"/>
+            </w:tcMar>
+          </w:tcPr>
+          <w:p>
+            <w:pPr>
+              <w:spacing w:before="0" w:after="0" w:line="252" w:lineRule="auto"/>
+            </w:pPr>
+            <w:r>
+              <w:rPr>
+                <w:rFonts w:ascii="Consolas" w:hAnsi="Consolas"/>
+                <w:color w:val="24292F"/>
+                <w:sz w:val="17"/>
+              </w:rPr>
+              <w:t>{</w:t>
+              <w:br/>
+              <w:t xml:space="preserve">  "id": "6acc5cc42577d09cacd3c23e",</w:t>
+              <w:br/>
+              <w:t xml:space="preserve">  "name": "Headphones",</w:t>
+              <w:br/>
+              <w:t xml:space="preserve">  "price": 1999.0,</w:t>
+              <w:br/>
+              <w:t xml:space="preserve">  "stock": 10</w:t>
+              <w:br/>
+              <w:t>}</w:t>
+            </w:r>
+          </w:p>
+        </w:tc>
+      </w:tr>
+    </w:tbl>
+    <w:p>
+      <w:pPr>
+        <w:spacing w:before="0" w:after="120"/>
+      </w:pPr>
+    </w:p>
+    <w:p>
+      <w:pPr>
+        <w:pStyle w:val="Heading2"/>
+        <w:spacing w:before="200" w:after="80"/>
+      </w:pPr>
+      <w:r>
+        <w:t>Update Product</w:t>
+      </w:r>
+    </w:p>
+    <w:p>
+      <w:pPr>
+        <w:spacing w:before="0" w:after="40"/>
+      </w:pPr>
+      <w:r>
+        <w:rPr>
+          <w:b/>
+        </w:rPr>
+        <w:t xml:space="preserve">Method: </w:t>
+      </w:r>
+      <w:r>
+        <w:rPr>
+          <w:rFonts w:ascii="Consolas" w:hAnsi="Consolas"/>
+          <w:b/>
+        </w:rPr>
+        <w:t>PUT</w:t>
+        <w:br/>
+      </w:r>
+      <w:r>
+        <w:rPr>
+          <w:b/>
+        </w:rPr>
+        <w:t xml:space="preserve">URL: </w:t>
+      </w:r>
+      <w:r>
+        <w:rPr>
+          <w:rFonts w:ascii="Consolas" w:hAnsi="Consolas"/>
+        </w:rPr>
+        <w:t>http://localhost:8080/api/products/6acc5cc42577d09cacd3c23e</w:t>
+        <w:br/>
+      </w:r>
+      <w:r>
+        <w:rPr>
+          <w:b/>
+        </w:rPr>
+        <w:t xml:space="preserve">Headers: </w:t>
+      </w:r>
+      <w:r>
+        <w:rPr>
+          <w:rFonts w:ascii="Consolas" w:hAnsi="Consolas"/>
+        </w:rPr>
+        <w:t>Content-Type: application/json</w:t>
+        <w:br/>
+      </w:r>
+      <w:r>
+        <w:rPr>
+          <w:sz w:val="19"/>
+        </w:rPr>
+        <w:t>Path Parameter: id = 6acc5cc42577d09cacd3c23e (Use actual ID returned by POST or GET; never use literal curly braces).</w:t>
+        <w:br/>
+      </w:r>
+      <w:r>
+        <w:rPr>
+          <w:b/>
+        </w:rPr>
+        <w:t>Body → raw → JSON</w:t>
+      </w:r>
+    </w:p>
+    <w:tbl>
+      <w:tblPr>
+        <w:tblW w:type="auto" w:w="0"/>
+        <w:tblLayout w:type="fixed"/>
+        <w:tblLook w:firstColumn="1" w:firstRow="1" w:lastColumn="0" w:lastRow="0" w:noHBand="0" w:noVBand="1" w:val="04A0"/>
+      </w:tblPr>
+      <w:tblGrid>
+        <w:gridCol w:w="10080"/>
+      </w:tblGrid>
+      <w:tr>
+        <w:tc>
+          <w:tcPr>
+            <w:tcW w:type="dxa" w:w="10080"/>
+            <w:shd w:fill="F6F8FA"/>
+            <w:tcBorders>
+              <w:top w:val="single" w:sz="4" w:space="0" w:color="D0D7DE"/>
+              <w:left w:val="single" w:sz="4" w:space="0" w:color="D0D7DE"/>
+              <w:bottom w:val="single" w:sz="4" w:space="0" w:color="D0D7DE"/>
+              <w:right w:val="single" w:sz="4" w:space="0" w:color="D0D7DE"/>
+            </w:tcBorders>
+            <w:tcMar>
+              <w:top w:w="120" w:type="dxa"/>
+              <w:left w:w="180" w:type="dxa"/>
+              <w:bottom w:w="120" w:type="dxa"/>
+              <w:right w:w="180" w:type="dxa"/>
+            </w:tcMar>
+          </w:tcPr>
+          <w:p>
+            <w:pPr>
+              <w:spacing w:before="0" w:after="0" w:line="252" w:lineRule="auto"/>
+            </w:pPr>
+            <w:r>
+              <w:rPr>
+                <w:rFonts w:ascii="Consolas" w:hAnsi="Consolas"/>
+                <w:color w:val="24292F"/>
+                <w:sz w:val="17"/>
+              </w:rPr>
+              <w:t>{</w:t>
+              <w:br/>
+              <w:t xml:space="preserve">  "name": "Headphones v2",</w:t>
+              <w:br/>
+              <w:t xml:space="preserve">  "price": 2499.0,</w:t>
+              <w:br/>
+              <w:t xml:space="preserve">  "stock": 8</w:t>
+              <w:br/>
+              <w:t>}</w:t>
+            </w:r>
+          </w:p>
+        </w:tc>
+      </w:tr>
+    </w:tbl>
+    <w:p>
+      <w:pPr>
+        <w:spacing w:before="0" w:after="120"/>
+      </w:pPr>
+    </w:p>
+    <w:p>
+      <w:pPr>
+        <w:spacing w:before="40" w:after="40"/>
+      </w:pPr>
+      <w:r>
+        <w:rPr>
+          <w:sz w:val="19"/>
+        </w:rPr>
+        <w:t>Expected Response:</w:t>
+        <w:br/>
+        <w:t>200 OK with updated product object (or null if not found):</w:t>
+      </w:r>
+    </w:p>
+    <w:tbl>
+      <w:tblPr>
+        <w:tblW w:type="auto" w:w="0"/>
+        <w:tblLayout w:type="fixed"/>
+        <w:tblLook w:firstColumn="1" w:firstRow="1" w:lastColumn="0" w:lastRow="0" w:noHBand="0" w:noVBand="1" w:val="04A0"/>
+      </w:tblPr>
+      <w:tblGrid>
+        <w:gridCol w:w="10080"/>
+      </w:tblGrid>
+      <w:tr>
+        <w:tc>
+          <w:tcPr>
+            <w:tcW w:type="dxa" w:w="10080"/>
+            <w:shd w:fill="F6F8FA"/>
+            <w:tcBorders>
+              <w:top w:val="single" w:sz="4" w:space="0" w:color="D0D7DE"/>
+              <w:left w:val="single" w:sz="4" w:space="0" w:color="D0D7DE"/>
+              <w:bottom w:val="single" w:sz="4" w:space="0" w:color="D0D7DE"/>
+              <w:right w:val="single" w:sz="4" w:space="0" w:color="D0D7DE"/>
+            </w:tcBorders>
+            <w:tcMar>
+              <w:top w:w="120" w:type="dxa"/>
+              <w:left w:w="180" w:type="dxa"/>
+              <w:bottom w:w="120" w:type="dxa"/>
+              <w:right w:w="180" w:type="dxa"/>
+            </w:tcMar>
+          </w:tcPr>
+          <w:p>
+            <w:pPr>
+              <w:spacing w:before="0" w:after="0" w:line="252" w:lineRule="auto"/>
+            </w:pPr>
+            <w:r>
+              <w:rPr>
+                <w:rFonts w:ascii="Consolas" w:hAnsi="Consolas"/>
+                <w:color w:val="24292F"/>
+                <w:sz w:val="17"/>
+              </w:rPr>
+              <w:t>{</w:t>
+              <w:br/>
+              <w:t xml:space="preserve">  "id": "6acc5cc42577d09cacd3c23e",</w:t>
+              <w:br/>
+              <w:t xml:space="preserve">  "name": "Headphones v2",</w:t>
+              <w:br/>
+              <w:t xml:space="preserve">  "price": 2499.0,</w:t>
+              <w:br/>
+              <w:t xml:space="preserve">  "stock": 8</w:t>
+              <w:br/>
+              <w:t>}</w:t>
+            </w:r>
+          </w:p>
+        </w:tc>
+      </w:tr>
+    </w:tbl>
+    <w:p>
+      <w:pPr>
+        <w:spacing w:before="0" w:after="120"/>
+      </w:pPr>
+    </w:p>
+    <w:p>
+      <w:pPr>
+        <w:pStyle w:val="Heading2"/>
+        <w:spacing w:before="200" w:after="80"/>
+      </w:pPr>
+      <w:r>
+        <w:t>Delete Product</w:t>
+      </w:r>
+    </w:p>
+    <w:p>
+      <w:pPr>
+        <w:spacing w:before="0" w:after="40"/>
+      </w:pPr>
+      <w:r>
+        <w:rPr>
+          <w:b/>
+        </w:rPr>
+        <w:t xml:space="preserve">Method: </w:t>
+      </w:r>
+      <w:r>
+        <w:rPr>
+          <w:rFonts w:ascii="Consolas" w:hAnsi="Consolas"/>
+          <w:b/>
+        </w:rPr>
+        <w:t>DELETE</w:t>
+        <w:br/>
+      </w:r>
+      <w:r>
+        <w:rPr>
+          <w:b/>
+        </w:rPr>
+        <w:t xml:space="preserve">URL: </w:t>
+      </w:r>
+      <w:r>
+        <w:rPr>
+          <w:rFonts w:ascii="Consolas" w:hAnsi="Consolas"/>
+        </w:rPr>
+        <w:t>http://localhost:8080/api/products/6acc5cc42577d09cacd3c23e</w:t>
+        <w:br/>
+      </w:r>
+      <w:r>
+        <w:rPr>
+          <w:sz w:val="19"/>
+        </w:rPr>
+        <w:t>Path Parameter: id = 6acc5cc42577d09cacd3c23e (Use actual ID returned by POST or GET; never use literal curly braces).</w:t>
+        <w:br/>
+      </w:r>
+      <w:r>
+        <w:rPr>
+          <w:b/>
+        </w:rPr>
+        <w:t>Body: None.</w:t>
+      </w:r>
+    </w:p>
+    <w:p>
+      <w:pPr>
+        <w:spacing w:before="40" w:after="40"/>
+      </w:pPr>
+      <w:r>
+        <w:rPr>
+          <w:sz w:val="19"/>
+        </w:rPr>
+        <w:t>Expected Response:</w:t>
+        <w:br/>
+        <w:t>200 OK with empty response body.</w:t>
+      </w:r>
+    </w:p>
+    <w:p>
+      <w:pPr>
+        <w:pStyle w:val="Heading2"/>
+        <w:spacing w:before="200" w:after="80"/>
+      </w:pPr>
+      <w:r>
+        <w:t>Search Products by Name</w:t>
+      </w:r>
+    </w:p>
+    <w:p>
+      <w:pPr>
+        <w:spacing w:before="0" w:after="40"/>
+      </w:pPr>
+      <w:r>
+        <w:rPr>
+          <w:b/>
+        </w:rPr>
+        <w:t xml:space="preserve">Method: </w:t>
+      </w:r>
+      <w:r>
+        <w:rPr>
+          <w:rFonts w:ascii="Consolas" w:hAnsi="Consolas"/>
+          <w:b/>
+        </w:rPr>
+        <w:t>GET</w:t>
+        <w:br/>
+      </w:r>
+      <w:r>
+        <w:rPr>
+          <w:b/>
+        </w:rPr>
+        <w:t xml:space="preserve">URL: </w:t>
+      </w:r>
+      <w:r>
+        <w:rPr>
+          <w:rFonts w:ascii="Consolas" w:hAnsi="Consolas"/>
+        </w:rPr>
+        <w:t>http://localhost:8080/api/products/search?name=Headphones</w:t>
+        <w:br/>
+      </w:r>
+      <w:r>
+        <w:rPr>
+          <w:b/>
+        </w:rPr>
+        <w:t xml:space="preserve">Headers: </w:t>
+      </w:r>
+      <w:r>
+        <w:rPr>
+          <w:rFonts w:ascii="Consolas" w:hAnsi="Consolas"/>
+        </w:rPr>
+        <w:t>Accept: application/json</w:t>
+        <w:br/>
+      </w:r>
+      <w:r>
+        <w:rPr>
+          <w:sz w:val="19"/>
+        </w:rPr>
+        <w:t>Query Parameter: name=Headphones</w:t>
+        <w:br/>
+      </w:r>
+      <w:r>
+        <w:rPr>
+          <w:b/>
+        </w:rPr>
+        <w:t>Body: None.</w:t>
+      </w:r>
+    </w:p>
+    <w:p>
+      <w:pPr>
+        <w:spacing w:before="40" w:after="40"/>
+      </w:pPr>
+      <w:r>
+        <w:rPr>
+          <w:sz w:val="19"/>
+        </w:rPr>
+        <w:t>Expected Response:</w:t>
+        <w:br/>
+        <w:t>200 OK with JSON array of matching products:</w:t>
+      </w:r>
+    </w:p>
+    <w:tbl>
+      <w:tblPr>
+        <w:tblW w:type="auto" w:w="0"/>
+        <w:tblLayout w:type="fixed"/>
+        <w:tblLook w:firstColumn="1" w:firstRow="1" w:lastColumn="0" w:lastRow="0" w:noHBand="0" w:noVBand="1" w:val="04A0"/>
+      </w:tblPr>
+      <w:tblGrid>
+        <w:gridCol w:w="10080"/>
+      </w:tblGrid>
+      <w:tr>
+        <w:tc>
+          <w:tcPr>
+            <w:tcW w:type="dxa" w:w="10080"/>
+            <w:shd w:fill="F6F8FA"/>
+            <w:tcBorders>
+              <w:top w:val="single" w:sz="4" w:space="0" w:color="D0D7DE"/>
+              <w:left w:val="single" w:sz="4" w:space="0" w:color="D0D7DE"/>
+              <w:bottom w:val="single" w:sz="4" w:space="0" w:color="D0D7DE"/>
+              <w:right w:val="single" w:sz="4" w:space="0" w:color="D0D7DE"/>
+            </w:tcBorders>
+            <w:tcMar>
+              <w:top w:w="120" w:type="dxa"/>
+              <w:left w:w="180" w:type="dxa"/>
+              <w:bottom w:w="120" w:type="dxa"/>
+              <w:right w:w="180" w:type="dxa"/>
+            </w:tcMar>
+          </w:tcPr>
+          <w:p>
+            <w:pPr>
+              <w:spacing w:before="0" w:after="0" w:line="252" w:lineRule="auto"/>
+            </w:pPr>
+            <w:r>
+              <w:rPr>
+                <w:rFonts w:ascii="Consolas" w:hAnsi="Consolas"/>
+                <w:color w:val="24292F"/>
+                <w:sz w:val="17"/>
+              </w:rPr>
+              <w:t>[</w:t>
+              <w:br/>
+              <w:t xml:space="preserve">  {</w:t>
+              <w:br/>
+              <w:t xml:space="preserve">    "id": "6acc5cc42577d09cacd3c23e",</w:t>
+              <w:br/>
+              <w:t xml:space="preserve">    "name": "Headphones",</w:t>
+              <w:br/>
+              <w:t xml:space="preserve">    "price": 1999.0,</w:t>
+              <w:br/>
+              <w:t xml:space="preserve">    "stock": 10</w:t>
+              <w:br/>
+              <w:t xml:space="preserve">  }</w:t>
+              <w:br/>
+              <w:t>]</w:t>
             </w:r>
           </w:p>
         </w:tc>

</xml_diff>

<commit_message>
Update complete guide with Voting Eligibility Servlet and add FullStack_Simple_CRUD_Basic_Router project
</commit_message>
<xml_diff>
--- a/Spring_Boot_Vue_Lab_Exam_Complete_Guide.docx
+++ b/Spring_Boot_Vue_Lab_Exam_Complete_Guide.docx
@@ -6532,6 +6532,1188 @@
         <w:spacing w:before="0" w:after="120"/>
       </w:pPr>
     </w:p>
+    <w:p>
+      <w:pPr>
+        <w:pStyle w:val="Heading1"/>
+        <w:spacing w:before="360" w:after="120"/>
+      </w:pPr>
+      <w:r>
+        <w:t>Voting Eligibility Servlet — Complete Lab Execution Guide</w:t>
+      </w:r>
+    </w:p>
+    <w:p>
+      <w:pPr>
+        <w:spacing w:before="0" w:after="120"/>
+      </w:pPr>
+      <w:r>
+        <w:rPr>
+          <w:i/>
+        </w:rPr>
+        <w:t>Tomcat 9 • Ubuntu / WSL • javax.servlet • POST form • Annotation-based mapping</w:t>
+      </w:r>
+    </w:p>
+    <w:p>
+      <w:pPr>
+        <w:spacing w:before="0" w:after="160"/>
+      </w:pPr>
+      <w:r>
+        <w:t>This practical accepts a name and age, then displays whether the person is eligible to vote. It uses the same annotation-based approach as Hello Servlet. No MySQL and no web.xml are required.</w:t>
+      </w:r>
+    </w:p>
+    <w:p>
+      <w:pPr>
+        <w:pStyle w:val="Heading2"/>
+        <w:spacing w:before="200" w:after="80"/>
+      </w:pPr>
+      <w:r>
+        <w:t>Step 1 — Go to the Tomcat directory</w:t>
+      </w:r>
+    </w:p>
+    <w:tbl>
+      <w:tblPr>
+        <w:tblW w:type="auto" w:w="0"/>
+        <w:tblLayout w:type="fixed"/>
+        <w:tblLook w:firstColumn="1" w:firstRow="1" w:lastColumn="0" w:lastRow="0" w:noHBand="0" w:noVBand="1" w:val="04A0"/>
+      </w:tblPr>
+      <w:tblGrid>
+        <w:gridCol w:w="10080"/>
+      </w:tblGrid>
+      <w:tr>
+        <w:tc>
+          <w:tcPr>
+            <w:tcW w:type="dxa" w:w="10080"/>
+            <w:shd w:fill="F6F8FA"/>
+            <w:tcBorders>
+              <w:top w:val="single" w:sz="4" w:space="0" w:color="D0D7DE"/>
+              <w:left w:val="single" w:sz="4" w:space="0" w:color="D0D7DE"/>
+              <w:bottom w:val="single" w:sz="4" w:space="0" w:color="D0D7DE"/>
+              <w:right w:val="single" w:sz="4" w:space="0" w:color="D0D7DE"/>
+            </w:tcBorders>
+            <w:tcMar>
+              <w:top w:w="120" w:type="dxa"/>
+              <w:left w:w="180" w:type="dxa"/>
+              <w:bottom w:w="120" w:type="dxa"/>
+              <w:right w:w="180" w:type="dxa"/>
+            </w:tcMar>
+          </w:tcPr>
+          <w:p>
+            <w:pPr>
+              <w:spacing w:before="0" w:after="0" w:line="252" w:lineRule="auto"/>
+            </w:pPr>
+            <w:r>
+              <w:rPr>
+                <w:rFonts w:ascii="Consolas" w:hAnsi="Consolas"/>
+                <w:color w:val="24292F"/>
+                <w:sz w:val="17"/>
+              </w:rPr>
+              <w:t>cd /mnt/c/Directory/coding/web-dev/Practical_Exam/temp/Servlet/apache-tomcat-9.0.87</w:t>
+            </w:r>
+          </w:p>
+        </w:tc>
+      </w:tr>
+    </w:tbl>
+    <w:p>
+      <w:pPr>
+        <w:spacing w:before="0" w:after="120"/>
+      </w:pPr>
+    </w:p>
+    <w:p>
+      <w:pPr>
+        <w:spacing w:before="0" w:after="80"/>
+      </w:pPr>
+      <w:r>
+        <w:t>Use your own Tomcat 9 path if it is different.</w:t>
+      </w:r>
+    </w:p>
+    <w:p>
+      <w:pPr>
+        <w:pStyle w:val="Heading2"/>
+        <w:spacing w:before="200" w:after="80"/>
+      </w:pPr>
+      <w:r>
+        <w:t>Step 2 — Create the application folders</w:t>
+      </w:r>
+    </w:p>
+    <w:tbl>
+      <w:tblPr>
+        <w:tblW w:type="auto" w:w="0"/>
+        <w:tblLayout w:type="fixed"/>
+        <w:tblLook w:firstColumn="1" w:firstRow="1" w:lastColumn="0" w:lastRow="0" w:noHBand="0" w:noVBand="1" w:val="04A0"/>
+      </w:tblPr>
+      <w:tblGrid>
+        <w:gridCol w:w="10080"/>
+      </w:tblGrid>
+      <w:tr>
+        <w:tc>
+          <w:tcPr>
+            <w:tcW w:type="dxa" w:w="10080"/>
+            <w:shd w:fill="F6F8FA"/>
+            <w:tcBorders>
+              <w:top w:val="single" w:sz="4" w:space="0" w:color="D0D7DE"/>
+              <w:left w:val="single" w:sz="4" w:space="0" w:color="D0D7DE"/>
+              <w:bottom w:val="single" w:sz="4" w:space="0" w:color="D0D7DE"/>
+              <w:right w:val="single" w:sz="4" w:space="0" w:color="D0D7DE"/>
+            </w:tcBorders>
+            <w:tcMar>
+              <w:top w:w="120" w:type="dxa"/>
+              <w:left w:w="180" w:type="dxa"/>
+              <w:bottom w:w="120" w:type="dxa"/>
+              <w:right w:w="180" w:type="dxa"/>
+            </w:tcMar>
+          </w:tcPr>
+          <w:p>
+            <w:pPr>
+              <w:spacing w:before="0" w:after="0" w:line="252" w:lineRule="auto"/>
+            </w:pPr>
+            <w:r>
+              <w:rPr>
+                <w:rFonts w:ascii="Consolas" w:hAnsi="Consolas"/>
+                <w:color w:val="24292F"/>
+                <w:sz w:val="17"/>
+              </w:rPr>
+              <w:t>mkdir -p webapps/voting-servlet/WEB-INF/classes</w:t>
+              <w:br/>
+              <w:t>cd webapps/voting-servlet</w:t>
+            </w:r>
+          </w:p>
+        </w:tc>
+      </w:tr>
+    </w:tbl>
+    <w:p>
+      <w:pPr>
+        <w:spacing w:before="0" w:after="120"/>
+      </w:pPr>
+    </w:p>
+    <w:p>
+      <w:pPr>
+        <w:spacing w:before="0" w:after="80"/>
+      </w:pPr>
+      <w:r>
+        <w:t>This creates a separate application named voting-servlet, so your existing Hello Servlet is not overwritten.</w:t>
+      </w:r>
+    </w:p>
+    <w:p>
+      <w:pPr>
+        <w:pStyle w:val="Heading2"/>
+        <w:spacing w:before="200" w:after="80"/>
+      </w:pPr>
+      <w:r>
+        <w:t>Step 3 — Create index.html</w:t>
+      </w:r>
+    </w:p>
+    <w:tbl>
+      <w:tblPr>
+        <w:tblW w:type="auto" w:w="0"/>
+        <w:tblLayout w:type="fixed"/>
+        <w:tblLook w:firstColumn="1" w:firstRow="1" w:lastColumn="0" w:lastRow="0" w:noHBand="0" w:noVBand="1" w:val="04A0"/>
+      </w:tblPr>
+      <w:tblGrid>
+        <w:gridCol w:w="10080"/>
+      </w:tblGrid>
+      <w:tr>
+        <w:tc>
+          <w:tcPr>
+            <w:tcW w:type="dxa" w:w="10080"/>
+            <w:shd w:fill="F6F8FA"/>
+            <w:tcBorders>
+              <w:top w:val="single" w:sz="4" w:space="0" w:color="D0D7DE"/>
+              <w:left w:val="single" w:sz="4" w:space="0" w:color="D0D7DE"/>
+              <w:bottom w:val="single" w:sz="4" w:space="0" w:color="D0D7DE"/>
+              <w:right w:val="single" w:sz="4" w:space="0" w:color="D0D7DE"/>
+            </w:tcBorders>
+            <w:tcMar>
+              <w:top w:w="120" w:type="dxa"/>
+              <w:left w:w="180" w:type="dxa"/>
+              <w:bottom w:w="120" w:type="dxa"/>
+              <w:right w:w="180" w:type="dxa"/>
+            </w:tcMar>
+          </w:tcPr>
+          <w:p>
+            <w:pPr>
+              <w:spacing w:before="0" w:after="0" w:line="252" w:lineRule="auto"/>
+            </w:pPr>
+            <w:r>
+              <w:rPr>
+                <w:rFonts w:ascii="Consolas" w:hAnsi="Consolas"/>
+                <w:color w:val="24292F"/>
+                <w:sz w:val="17"/>
+              </w:rPr>
+              <w:t>nano index.html</w:t>
+            </w:r>
+          </w:p>
+        </w:tc>
+      </w:tr>
+    </w:tbl>
+    <w:p>
+      <w:pPr>
+        <w:spacing w:before="0" w:after="120"/>
+      </w:pPr>
+    </w:p>
+    <w:p>
+      <w:pPr>
+        <w:spacing w:before="0" w:after="80"/>
+      </w:pPr>
+      <w:r>
+        <w:t>Paste:</w:t>
+      </w:r>
+    </w:p>
+    <w:tbl>
+      <w:tblPr>
+        <w:tblW w:type="auto" w:w="0"/>
+        <w:tblLayout w:type="fixed"/>
+        <w:tblLook w:firstColumn="1" w:firstRow="1" w:lastColumn="0" w:lastRow="0" w:noHBand="0" w:noVBand="1" w:val="04A0"/>
+      </w:tblPr>
+      <w:tblGrid>
+        <w:gridCol w:w="10080"/>
+      </w:tblGrid>
+      <w:tr>
+        <w:tc>
+          <w:tcPr>
+            <w:tcW w:type="dxa" w:w="10080"/>
+            <w:shd w:fill="F6F8FA"/>
+            <w:tcBorders>
+              <w:top w:val="single" w:sz="4" w:space="0" w:color="D0D7DE"/>
+              <w:left w:val="single" w:sz="4" w:space="0" w:color="D0D7DE"/>
+              <w:bottom w:val="single" w:sz="4" w:space="0" w:color="D0D7DE"/>
+              <w:right w:val="single" w:sz="4" w:space="0" w:color="D0D7DE"/>
+            </w:tcBorders>
+            <w:tcMar>
+              <w:top w:w="120" w:type="dxa"/>
+              <w:left w:w="180" w:type="dxa"/>
+              <w:bottom w:w="120" w:type="dxa"/>
+              <w:right w:w="180" w:type="dxa"/>
+            </w:tcMar>
+          </w:tcPr>
+          <w:p>
+            <w:pPr>
+              <w:spacing w:before="0" w:after="0" w:line="252" w:lineRule="auto"/>
+            </w:pPr>
+            <w:r>
+              <w:rPr>
+                <w:rFonts w:ascii="Consolas" w:hAnsi="Consolas"/>
+                <w:color w:val="24292F"/>
+                <w:sz w:val="17"/>
+              </w:rPr>
+              <w:t>&lt;!DOCTYPE html&gt;</w:t>
+              <w:br/>
+              <w:t>&lt;html&gt;</w:t>
+              <w:br/>
+              <w:t>&lt;head&gt;</w:t>
+              <w:br/>
+              <w:t xml:space="preserve">    &lt;title&gt;Voting Eligibility&lt;/title&gt;</w:t>
+              <w:br/>
+              <w:t>&lt;/head&gt;</w:t>
+              <w:br/>
+              <w:t>&lt;body&gt;</w:t>
+              <w:br/>
+              <w:t xml:space="preserve">    &lt;h2&gt;Voting Eligibility&lt;/h2&gt;</w:t>
+              <w:br/>
+              <w:t xml:space="preserve">    &lt;form action="vote" method="post"&gt;</w:t>
+              <w:br/>
+              <w:t xml:space="preserve">        Name: &lt;input type="text" name="name" required&gt;&lt;br&gt;&lt;br&gt;</w:t>
+              <w:br/>
+              <w:t xml:space="preserve">        Age: &lt;input type="number" name="age" required&gt;&lt;br&gt;&lt;br&gt;</w:t>
+              <w:br/>
+              <w:t xml:space="preserve">        &lt;input type="submit" value="Check Eligibility"&gt;</w:t>
+              <w:br/>
+              <w:t xml:space="preserve">    &lt;/form&gt;</w:t>
+              <w:br/>
+              <w:t>&lt;/body&gt;</w:t>
+              <w:br/>
+              <w:t>&lt;/html&gt;</w:t>
+            </w:r>
+          </w:p>
+        </w:tc>
+      </w:tr>
+    </w:tbl>
+    <w:p>
+      <w:pPr>
+        <w:spacing w:before="0" w:after="120"/>
+      </w:pPr>
+    </w:p>
+    <w:p>
+      <w:pPr>
+        <w:spacing w:before="0" w:after="80"/>
+      </w:pPr>
+      <w:r>
+        <w:t>Save in Nano: Ctrl+O, press Enter, then Ctrl+X.</w:t>
+      </w:r>
+    </w:p>
+    <w:p>
+      <w:pPr>
+        <w:pStyle w:val="Heading2"/>
+        <w:spacing w:before="200" w:after="80"/>
+      </w:pPr>
+      <w:r>
+        <w:t>Step 4 — Create VoteServlet.java</w:t>
+      </w:r>
+    </w:p>
+    <w:tbl>
+      <w:tblPr>
+        <w:tblW w:type="auto" w:w="0"/>
+        <w:tblLayout w:type="fixed"/>
+        <w:tblLook w:firstColumn="1" w:firstRow="1" w:lastColumn="0" w:lastRow="0" w:noHBand="0" w:noVBand="1" w:val="04A0"/>
+      </w:tblPr>
+      <w:tblGrid>
+        <w:gridCol w:w="10080"/>
+      </w:tblGrid>
+      <w:tr>
+        <w:tc>
+          <w:tcPr>
+            <w:tcW w:type="dxa" w:w="10080"/>
+            <w:shd w:fill="F6F8FA"/>
+            <w:tcBorders>
+              <w:top w:val="single" w:sz="4" w:space="0" w:color="D0D7DE"/>
+              <w:left w:val="single" w:sz="4" w:space="0" w:color="D0D7DE"/>
+              <w:bottom w:val="single" w:sz="4" w:space="0" w:color="D0D7DE"/>
+              <w:right w:val="single" w:sz="4" w:space="0" w:color="D0D7DE"/>
+            </w:tcBorders>
+            <w:tcMar>
+              <w:top w:w="120" w:type="dxa"/>
+              <w:left w:w="180" w:type="dxa"/>
+              <w:bottom w:w="120" w:type="dxa"/>
+              <w:right w:w="180" w:type="dxa"/>
+            </w:tcMar>
+          </w:tcPr>
+          <w:p>
+            <w:pPr>
+              <w:spacing w:before="0" w:after="0" w:line="252" w:lineRule="auto"/>
+            </w:pPr>
+            <w:r>
+              <w:rPr>
+                <w:rFonts w:ascii="Consolas" w:hAnsi="Consolas"/>
+                <w:color w:val="24292F"/>
+                <w:sz w:val="17"/>
+              </w:rPr>
+              <w:t>nano VoteServlet.java</w:t>
+            </w:r>
+          </w:p>
+        </w:tc>
+      </w:tr>
+    </w:tbl>
+    <w:p>
+      <w:pPr>
+        <w:spacing w:before="0" w:after="120"/>
+      </w:pPr>
+    </w:p>
+    <w:p>
+      <w:pPr>
+        <w:spacing w:before="0" w:after="80"/>
+      </w:pPr>
+      <w:r>
+        <w:t>Paste:</w:t>
+      </w:r>
+    </w:p>
+    <w:tbl>
+      <w:tblPr>
+        <w:tblW w:type="auto" w:w="0"/>
+        <w:tblLayout w:type="fixed"/>
+        <w:tblLook w:firstColumn="1" w:firstRow="1" w:lastColumn="0" w:lastRow="0" w:noHBand="0" w:noVBand="1" w:val="04A0"/>
+      </w:tblPr>
+      <w:tblGrid>
+        <w:gridCol w:w="10080"/>
+      </w:tblGrid>
+      <w:tr>
+        <w:tc>
+          <w:tcPr>
+            <w:tcW w:type="dxa" w:w="10080"/>
+            <w:shd w:fill="F6F8FA"/>
+            <w:tcBorders>
+              <w:top w:val="single" w:sz="4" w:space="0" w:color="D0D7DE"/>
+              <w:left w:val="single" w:sz="4" w:space="0" w:color="D0D7DE"/>
+              <w:bottom w:val="single" w:sz="4" w:space="0" w:color="D0D7DE"/>
+              <w:right w:val="single" w:sz="4" w:space="0" w:color="D0D7DE"/>
+            </w:tcBorders>
+            <w:tcMar>
+              <w:top w:w="120" w:type="dxa"/>
+              <w:left w:w="180" w:type="dxa"/>
+              <w:bottom w:w="120" w:type="dxa"/>
+              <w:right w:w="180" w:type="dxa"/>
+            </w:tcMar>
+          </w:tcPr>
+          <w:p>
+            <w:pPr>
+              <w:spacing w:before="0" w:after="0" w:line="252" w:lineRule="auto"/>
+            </w:pPr>
+            <w:r>
+              <w:rPr>
+                <w:rFonts w:ascii="Consolas" w:hAnsi="Consolas"/>
+                <w:color w:val="24292F"/>
+                <w:sz w:val="17"/>
+              </w:rPr>
+              <w:t>package com;</w:t>
+              <w:br/>
+              <w:br/>
+              <w:t>import java.io.PrintWriter;</w:t>
+              <w:br/>
+              <w:t>import javax.servlet.http.*;</w:t>
+              <w:br/>
+              <w:t>import javax.servlet.annotation.WebServlet;</w:t>
+              <w:br/>
+              <w:br/>
+              <w:t>@WebServlet("/vote")</w:t>
+              <w:br/>
+              <w:t>public class VoteServlet extends HttpServlet {</w:t>
+              <w:br/>
+              <w:br/>
+              <w:t xml:space="preserve">    public void doPost(HttpServletRequest request,</w:t>
+              <w:br/>
+              <w:t xml:space="preserve">                       HttpServletResponse response) {</w:t>
+              <w:br/>
+              <w:br/>
+              <w:t xml:space="preserve">        response.setContentType("text/html;charset=UTF-8");</w:t>
+              <w:br/>
+              <w:br/>
+              <w:t xml:space="preserve">        try {</w:t>
+              <w:br/>
+              <w:t xml:space="preserve">            PrintWriter out = response.getWriter();</w:t>
+              <w:br/>
+              <w:br/>
+              <w:t xml:space="preserve">            String name = request.getParameter("name");</w:t>
+              <w:br/>
+              <w:t xml:space="preserve">            int age = Integer.parseInt(request.getParameter("age"));</w:t>
+              <w:br/>
+              <w:br/>
+              <w:t xml:space="preserve">            out.println("&lt;html&gt;&lt;body&gt;");</w:t>
+              <w:br/>
+              <w:t xml:space="preserve">            out.println("&lt;h2&gt;Name: " + name + "&lt;/h2&gt;");</w:t>
+              <w:br/>
+              <w:t xml:space="preserve">            out.println("&lt;h2&gt;Age: " + age + "&lt;/h2&gt;");</w:t>
+              <w:br/>
+              <w:br/>
+              <w:t xml:space="preserve">            if (age &gt; 18) {</w:t>
+              <w:br/>
+              <w:t xml:space="preserve">                out.println("&lt;h2&gt;Eligible to vote&lt;/h2&gt;");</w:t>
+              <w:br/>
+              <w:t xml:space="preserve">            } else {</w:t>
+              <w:br/>
+              <w:t xml:space="preserve">                out.println("&lt;h2&gt;Not eligible to vote&lt;/h2&gt;");</w:t>
+              <w:br/>
+              <w:t xml:space="preserve">            }</w:t>
+              <w:br/>
+              <w:br/>
+              <w:t xml:space="preserve">            out.println("&lt;/body&gt;&lt;/html&gt;");</w:t>
+              <w:br/>
+              <w:br/>
+              <w:t xml:space="preserve">        } catch (Exception e) {</w:t>
+              <w:br/>
+              <w:t xml:space="preserve">            e.printStackTrace();</w:t>
+              <w:br/>
+              <w:t xml:space="preserve">        }</w:t>
+              <w:br/>
+              <w:t xml:space="preserve">    }</w:t>
+              <w:br/>
+              <w:t>}</w:t>
+            </w:r>
+          </w:p>
+        </w:tc>
+      </w:tr>
+    </w:tbl>
+    <w:p>
+      <w:pPr>
+        <w:spacing w:before="0" w:after="120"/>
+      </w:pPr>
+    </w:p>
+    <w:p>
+      <w:pPr>
+        <w:spacing w:before="0" w:after="80"/>
+      </w:pPr>
+      <w:r>
+        <w:t>Save: Ctrl+O, press Enter, then Ctrl+X.</w:t>
+      </w:r>
+    </w:p>
+    <w:p>
+      <w:pPr>
+        <w:spacing w:before="0" w:after="80"/>
+      </w:pPr>
+      <w:r>
+        <w:t>The @WebServlet("/vote") annotation maps the URL to this servlet, so web.xml is not needed. Since this uses Tomcat 9, keep the javax.servlet imports.</w:t>
+      </w:r>
+    </w:p>
+    <w:p>
+      <w:pPr>
+        <w:pStyle w:val="Heading2"/>
+        <w:spacing w:before="200" w:after="80"/>
+      </w:pPr>
+      <w:r>
+        <w:t>Step 5 — Compile the servlet</w:t>
+      </w:r>
+    </w:p>
+    <w:p>
+      <w:pPr>
+        <w:spacing w:before="0" w:after="80"/>
+      </w:pPr>
+      <w:r>
+        <w:t>Run this while inside the voting-servlet folder:</w:t>
+      </w:r>
+    </w:p>
+    <w:tbl>
+      <w:tblPr>
+        <w:tblW w:type="auto" w:w="0"/>
+        <w:tblLayout w:type="fixed"/>
+        <w:tblLook w:firstColumn="1" w:firstRow="1" w:lastColumn="0" w:lastRow="0" w:noHBand="0" w:noVBand="1" w:val="04A0"/>
+      </w:tblPr>
+      <w:tblGrid>
+        <w:gridCol w:w="10080"/>
+      </w:tblGrid>
+      <w:tr>
+        <w:tc>
+          <w:tcPr>
+            <w:tcW w:type="dxa" w:w="10080"/>
+            <w:shd w:fill="F6F8FA"/>
+            <w:tcBorders>
+              <w:top w:val="single" w:sz="4" w:space="0" w:color="D0D7DE"/>
+              <w:left w:val="single" w:sz="4" w:space="0" w:color="D0D7DE"/>
+              <w:bottom w:val="single" w:sz="4" w:space="0" w:color="D0D7DE"/>
+              <w:right w:val="single" w:sz="4" w:space="0" w:color="D0D7DE"/>
+            </w:tcBorders>
+            <w:tcMar>
+              <w:top w:w="120" w:type="dxa"/>
+              <w:left w:w="180" w:type="dxa"/>
+              <w:bottom w:w="120" w:type="dxa"/>
+              <w:right w:w="180" w:type="dxa"/>
+            </w:tcMar>
+          </w:tcPr>
+          <w:p>
+            <w:pPr>
+              <w:spacing w:before="0" w:after="0" w:line="252" w:lineRule="auto"/>
+            </w:pPr>
+            <w:r>
+              <w:rPr>
+                <w:rFonts w:ascii="Consolas" w:hAnsi="Consolas"/>
+                <w:color w:val="24292F"/>
+                <w:sz w:val="17"/>
+              </w:rPr>
+              <w:t>javac -cp "../../lib/*" -d WEB-INF/classes VoteServlet.java</w:t>
+            </w:r>
+          </w:p>
+        </w:tc>
+      </w:tr>
+    </w:tbl>
+    <w:p>
+      <w:pPr>
+        <w:spacing w:before="0" w:after="120"/>
+      </w:pPr>
+    </w:p>
+    <w:p>
+      <w:pPr>
+        <w:spacing w:before="0" w:after="80"/>
+      </w:pPr>
+      <w:r>
+        <w:t>If compilation succeeds, javac prints no errors. Check the compiled class:</w:t>
+      </w:r>
+    </w:p>
+    <w:tbl>
+      <w:tblPr>
+        <w:tblW w:type="auto" w:w="0"/>
+        <w:tblLayout w:type="fixed"/>
+        <w:tblLook w:firstColumn="1" w:firstRow="1" w:lastColumn="0" w:lastRow="0" w:noHBand="0" w:noVBand="1" w:val="04A0"/>
+      </w:tblPr>
+      <w:tblGrid>
+        <w:gridCol w:w="10080"/>
+      </w:tblGrid>
+      <w:tr>
+        <w:tc>
+          <w:tcPr>
+            <w:tcW w:type="dxa" w:w="10080"/>
+            <w:shd w:fill="F6F8FA"/>
+            <w:tcBorders>
+              <w:top w:val="single" w:sz="4" w:space="0" w:color="D0D7DE"/>
+              <w:left w:val="single" w:sz="4" w:space="0" w:color="D0D7DE"/>
+              <w:bottom w:val="single" w:sz="4" w:space="0" w:color="D0D7DE"/>
+              <w:right w:val="single" w:sz="4" w:space="0" w:color="D0D7DE"/>
+            </w:tcBorders>
+            <w:tcMar>
+              <w:top w:w="120" w:type="dxa"/>
+              <w:left w:w="180" w:type="dxa"/>
+              <w:bottom w:w="120" w:type="dxa"/>
+              <w:right w:w="180" w:type="dxa"/>
+            </w:tcMar>
+          </w:tcPr>
+          <w:p>
+            <w:pPr>
+              <w:spacing w:before="0" w:after="0" w:line="252" w:lineRule="auto"/>
+            </w:pPr>
+            <w:r>
+              <w:rPr>
+                <w:rFonts w:ascii="Consolas" w:hAnsi="Consolas"/>
+                <w:color w:val="24292F"/>
+                <w:sz w:val="17"/>
+              </w:rPr>
+              <w:t>ls WEB-INF/classes/com</w:t>
+            </w:r>
+          </w:p>
+        </w:tc>
+      </w:tr>
+    </w:tbl>
+    <w:p>
+      <w:pPr>
+        <w:spacing w:before="0" w:after="120"/>
+      </w:pPr>
+    </w:p>
+    <w:p>
+      <w:pPr>
+        <w:spacing w:before="0" w:after="80"/>
+      </w:pPr>
+      <w:r>
+        <w:t>Expected output:</w:t>
+      </w:r>
+    </w:p>
+    <w:tbl>
+      <w:tblPr>
+        <w:tblW w:type="auto" w:w="0"/>
+        <w:tblLayout w:type="fixed"/>
+        <w:tblLook w:firstColumn="1" w:firstRow="1" w:lastColumn="0" w:lastRow="0" w:noHBand="0" w:noVBand="1" w:val="04A0"/>
+      </w:tblPr>
+      <w:tblGrid>
+        <w:gridCol w:w="10080"/>
+      </w:tblGrid>
+      <w:tr>
+        <w:tc>
+          <w:tcPr>
+            <w:tcW w:type="dxa" w:w="10080"/>
+            <w:shd w:fill="F6F8FA"/>
+            <w:tcBorders>
+              <w:top w:val="single" w:sz="4" w:space="0" w:color="D0D7DE"/>
+              <w:left w:val="single" w:sz="4" w:space="0" w:color="D0D7DE"/>
+              <w:bottom w:val="single" w:sz="4" w:space="0" w:color="D0D7DE"/>
+              <w:right w:val="single" w:sz="4" w:space="0" w:color="D0D7DE"/>
+            </w:tcBorders>
+            <w:tcMar>
+              <w:top w:w="120" w:type="dxa"/>
+              <w:left w:w="180" w:type="dxa"/>
+              <w:bottom w:w="120" w:type="dxa"/>
+              <w:right w:w="180" w:type="dxa"/>
+            </w:tcMar>
+          </w:tcPr>
+          <w:p>
+            <w:pPr>
+              <w:spacing w:before="0" w:after="0" w:line="252" w:lineRule="auto"/>
+            </w:pPr>
+            <w:r>
+              <w:rPr>
+                <w:rFonts w:ascii="Consolas" w:hAnsi="Consolas"/>
+                <w:color w:val="24292F"/>
+                <w:sz w:val="17"/>
+              </w:rPr>
+              <w:t>VoteServlet.class</w:t>
+            </w:r>
+          </w:p>
+        </w:tc>
+      </w:tr>
+    </w:tbl>
+    <w:p>
+      <w:pPr>
+        <w:spacing w:before="0" w:after="120"/>
+      </w:pPr>
+    </w:p>
+    <w:p>
+      <w:pPr>
+        <w:pStyle w:val="Heading2"/>
+        <w:spacing w:before="200" w:after="80"/>
+      </w:pPr>
+      <w:r>
+        <w:t>Step 6 — Check the folder structure</w:t>
+      </w:r>
+    </w:p>
+    <w:tbl>
+      <w:tblPr>
+        <w:tblW w:type="auto" w:w="0"/>
+        <w:tblLayout w:type="fixed"/>
+        <w:tblLook w:firstColumn="1" w:firstRow="1" w:lastColumn="0" w:lastRow="0" w:noHBand="0" w:noVBand="1" w:val="04A0"/>
+      </w:tblPr>
+      <w:tblGrid>
+        <w:gridCol w:w="10080"/>
+      </w:tblGrid>
+      <w:tr>
+        <w:tc>
+          <w:tcPr>
+            <w:tcW w:type="dxa" w:w="10080"/>
+            <w:shd w:fill="F6F8FA"/>
+            <w:tcBorders>
+              <w:top w:val="single" w:sz="4" w:space="0" w:color="D0D7DE"/>
+              <w:left w:val="single" w:sz="4" w:space="0" w:color="D0D7DE"/>
+              <w:bottom w:val="single" w:sz="4" w:space="0" w:color="D0D7DE"/>
+              <w:right w:val="single" w:sz="4" w:space="0" w:color="D0D7DE"/>
+            </w:tcBorders>
+            <w:tcMar>
+              <w:top w:w="120" w:type="dxa"/>
+              <w:left w:w="180" w:type="dxa"/>
+              <w:bottom w:w="120" w:type="dxa"/>
+              <w:right w:w="180" w:type="dxa"/>
+            </w:tcMar>
+          </w:tcPr>
+          <w:p>
+            <w:pPr>
+              <w:spacing w:before="0" w:after="0" w:line="252" w:lineRule="auto"/>
+            </w:pPr>
+            <w:r>
+              <w:rPr>
+                <w:rFonts w:ascii="Consolas" w:hAnsi="Consolas"/>
+                <w:color w:val="24292F"/>
+                <w:sz w:val="17"/>
+              </w:rPr>
+              <w:t>voting-servlet/</w:t>
+              <w:br/>
+              <w:t>├── index.html</w:t>
+              <w:br/>
+              <w:t>├── VoteServlet.java</w:t>
+              <w:br/>
+              <w:t>└── WEB-INF/</w:t>
+              <w:br/>
+              <w:t xml:space="preserve">    └── classes/</w:t>
+              <w:br/>
+              <w:t xml:space="preserve">        └── com/</w:t>
+              <w:br/>
+              <w:t xml:space="preserve">            └── VoteServlet.class</w:t>
+            </w:r>
+          </w:p>
+        </w:tc>
+      </w:tr>
+    </w:tbl>
+    <w:p>
+      <w:pPr>
+        <w:spacing w:before="0" w:after="120"/>
+      </w:pPr>
+    </w:p>
+    <w:p>
+      <w:pPr>
+        <w:spacing w:before="0" w:after="80"/>
+      </w:pPr>
+      <w:r>
+        <w:t>There is no web.xml in this annotation-based version.</w:t>
+      </w:r>
+    </w:p>
+    <w:p>
+      <w:pPr>
+        <w:pStyle w:val="Heading2"/>
+        <w:spacing w:before="200" w:after="80"/>
+      </w:pPr>
+      <w:r>
+        <w:t>Step 7 — Start or restart Tomcat</w:t>
+      </w:r>
+    </w:p>
+    <w:p>
+      <w:pPr>
+        <w:spacing w:before="0" w:after="80"/>
+      </w:pPr>
+      <w:r>
+        <w:t>Return to the Tomcat root:</w:t>
+      </w:r>
+    </w:p>
+    <w:tbl>
+      <w:tblPr>
+        <w:tblW w:type="auto" w:w="0"/>
+        <w:tblLayout w:type="fixed"/>
+        <w:tblLook w:firstColumn="1" w:firstRow="1" w:lastColumn="0" w:lastRow="0" w:noHBand="0" w:noVBand="1" w:val="04A0"/>
+      </w:tblPr>
+      <w:tblGrid>
+        <w:gridCol w:w="10080"/>
+      </w:tblGrid>
+      <w:tr>
+        <w:tc>
+          <w:tcPr>
+            <w:tcW w:type="dxa" w:w="10080"/>
+            <w:shd w:fill="F6F8FA"/>
+            <w:tcBorders>
+              <w:top w:val="single" w:sz="4" w:space="0" w:color="D0D7DE"/>
+              <w:left w:val="single" w:sz="4" w:space="0" w:color="D0D7DE"/>
+              <w:bottom w:val="single" w:sz="4" w:space="0" w:color="D0D7DE"/>
+              <w:right w:val="single" w:sz="4" w:space="0" w:color="D0D7DE"/>
+            </w:tcBorders>
+            <w:tcMar>
+              <w:top w:w="120" w:type="dxa"/>
+              <w:left w:w="180" w:type="dxa"/>
+              <w:bottom w:w="120" w:type="dxa"/>
+              <w:right w:w="180" w:type="dxa"/>
+            </w:tcMar>
+          </w:tcPr>
+          <w:p>
+            <w:pPr>
+              <w:spacing w:before="0" w:after="0" w:line="252" w:lineRule="auto"/>
+            </w:pPr>
+            <w:r>
+              <w:rPr>
+                <w:rFonts w:ascii="Consolas" w:hAnsi="Consolas"/>
+                <w:color w:val="24292F"/>
+                <w:sz w:val="17"/>
+              </w:rPr>
+              <w:t>cd /mnt/c/Directory/coding/web-dev/Practical_Exam/temp/Servlet/apache-tomcat-9.0.87</w:t>
+            </w:r>
+          </w:p>
+        </w:tc>
+      </w:tr>
+    </w:tbl>
+    <w:p>
+      <w:pPr>
+        <w:spacing w:before="0" w:after="120"/>
+      </w:pPr>
+    </w:p>
+    <w:p>
+      <w:pPr>
+        <w:spacing w:before="0" w:after="80"/>
+      </w:pPr>
+      <w:r>
+        <w:t>If Tomcat is not already running, start it:</w:t>
+      </w:r>
+    </w:p>
+    <w:tbl>
+      <w:tblPr>
+        <w:tblW w:type="auto" w:w="0"/>
+        <w:tblLayout w:type="fixed"/>
+        <w:tblLook w:firstColumn="1" w:firstRow="1" w:lastColumn="0" w:lastRow="0" w:noHBand="0" w:noVBand="1" w:val="04A0"/>
+      </w:tblPr>
+      <w:tblGrid>
+        <w:gridCol w:w="10080"/>
+      </w:tblGrid>
+      <w:tr>
+        <w:tc>
+          <w:tcPr>
+            <w:tcW w:type="dxa" w:w="10080"/>
+            <w:shd w:fill="F6F8FA"/>
+            <w:tcBorders>
+              <w:top w:val="single" w:sz="4" w:space="0" w:color="D0D7DE"/>
+              <w:left w:val="single" w:sz="4" w:space="0" w:color="D0D7DE"/>
+              <w:bottom w:val="single" w:sz="4" w:space="0" w:color="D0D7DE"/>
+              <w:right w:val="single" w:sz="4" w:space="0" w:color="D0D7DE"/>
+            </w:tcBorders>
+            <w:tcMar>
+              <w:top w:w="120" w:type="dxa"/>
+              <w:left w:w="180" w:type="dxa"/>
+              <w:bottom w:w="120" w:type="dxa"/>
+              <w:right w:w="180" w:type="dxa"/>
+            </w:tcMar>
+          </w:tcPr>
+          <w:p>
+            <w:pPr>
+              <w:spacing w:before="0" w:after="0" w:line="252" w:lineRule="auto"/>
+            </w:pPr>
+            <w:r>
+              <w:rPr>
+                <w:rFonts w:ascii="Consolas" w:hAnsi="Consolas"/>
+                <w:color w:val="24292F"/>
+                <w:sz w:val="17"/>
+              </w:rPr>
+              <w:t>./bin/startup.sh</w:t>
+            </w:r>
+          </w:p>
+        </w:tc>
+      </w:tr>
+    </w:tbl>
+    <w:p>
+      <w:pPr>
+        <w:spacing w:before="0" w:after="120"/>
+      </w:pPr>
+    </w:p>
+    <w:p>
+      <w:pPr>
+        <w:spacing w:before="0" w:after="80"/>
+      </w:pPr>
+      <w:r>
+        <w:t>If you need to restart after recompiling, run:</w:t>
+      </w:r>
+    </w:p>
+    <w:tbl>
+      <w:tblPr>
+        <w:tblW w:type="auto" w:w="0"/>
+        <w:tblLayout w:type="fixed"/>
+        <w:tblLook w:firstColumn="1" w:firstRow="1" w:lastColumn="0" w:lastRow="0" w:noHBand="0" w:noVBand="1" w:val="04A0"/>
+      </w:tblPr>
+      <w:tblGrid>
+        <w:gridCol w:w="10080"/>
+      </w:tblGrid>
+      <w:tr>
+        <w:tc>
+          <w:tcPr>
+            <w:tcW w:type="dxa" w:w="10080"/>
+            <w:shd w:fill="F6F8FA"/>
+            <w:tcBorders>
+              <w:top w:val="single" w:sz="4" w:space="0" w:color="D0D7DE"/>
+              <w:left w:val="single" w:sz="4" w:space="0" w:color="D0D7DE"/>
+              <w:bottom w:val="single" w:sz="4" w:space="0" w:color="D0D7DE"/>
+              <w:right w:val="single" w:sz="4" w:space="0" w:color="D0D7DE"/>
+            </w:tcBorders>
+            <w:tcMar>
+              <w:top w:w="120" w:type="dxa"/>
+              <w:left w:w="180" w:type="dxa"/>
+              <w:bottom w:w="120" w:type="dxa"/>
+              <w:right w:w="180" w:type="dxa"/>
+            </w:tcMar>
+          </w:tcPr>
+          <w:p>
+            <w:pPr>
+              <w:spacing w:before="0" w:after="0" w:line="252" w:lineRule="auto"/>
+            </w:pPr>
+            <w:r>
+              <w:rPr>
+                <w:rFonts w:ascii="Consolas" w:hAnsi="Consolas"/>
+                <w:color w:val="24292F"/>
+                <w:sz w:val="17"/>
+              </w:rPr>
+              <w:t>./bin/shutdown.sh</w:t>
+              <w:br/>
+              <w:t>./bin/startup.sh</w:t>
+            </w:r>
+          </w:p>
+        </w:tc>
+      </w:tr>
+    </w:tbl>
+    <w:p>
+      <w:pPr>
+        <w:spacing w:before="0" w:after="120"/>
+      </w:pPr>
+    </w:p>
+    <w:p>
+      <w:pPr>
+        <w:spacing w:before="0" w:after="80"/>
+      </w:pPr>
+      <w:r>
+        <w:t>Do not start a second Tomcat instance if it is already running.</w:t>
+      </w:r>
+    </w:p>
+    <w:p>
+      <w:pPr>
+        <w:pStyle w:val="Heading2"/>
+        <w:spacing w:before="200" w:after="80"/>
+      </w:pPr>
+      <w:r>
+        <w:t>Step 8 — Test in the browser</w:t>
+      </w:r>
+    </w:p>
+    <w:p>
+      <w:pPr>
+        <w:spacing w:before="0" w:after="80"/>
+      </w:pPr>
+      <w:r>
+        <w:t>Open:</w:t>
+      </w:r>
+    </w:p>
+    <w:p>
+      <w:pPr>
+        <w:spacing w:before="0" w:after="80"/>
+      </w:pPr>
+      <w:r>
+        <w:t>http://localhost:8080/voting-servlet/</w:t>
+      </w:r>
+    </w:p>
+    <w:p>
+      <w:pPr>
+        <w:spacing w:before="0" w:after="80"/>
+      </w:pPr>
+      <w:r>
+        <w:t>Enter a name and age, then click Check Eligibility.</w:t>
+      </w:r>
+    </w:p>
+    <w:p>
+      <w:pPr>
+        <w:spacing w:before="0" w:after="80"/>
+      </w:pPr>
+      <w:r>
+        <w:t>Examples:</w:t>
+      </w:r>
+    </w:p>
+    <w:p>
+      <w:pPr>
+        <w:pStyle w:val="ListBullet"/>
+        <w:spacing w:before="0" w:after="40"/>
+      </w:pPr>
+      <w:r>
+        <w:t>Name: Arun, Age: 20 → Eligible to vote</w:t>
+      </w:r>
+    </w:p>
+    <w:p>
+      <w:pPr>
+        <w:pStyle w:val="ListBullet"/>
+        <w:spacing w:before="0" w:after="40"/>
+      </w:pPr>
+      <w:r>
+        <w:t>Name: Meena, Age: 18 → Not eligible to vote</w:t>
+      </w:r>
+    </w:p>
+    <w:p>
+      <w:pPr>
+        <w:pStyle w:val="ListBullet"/>
+        <w:spacing w:before="0" w:after="40"/>
+      </w:pPr>
+      <w:r>
+        <w:t>Name: Ravi, Age: 16 → Not eligible to vote</w:t>
+      </w:r>
+    </w:p>
+    <w:p>
+      <w:pPr>
+        <w:spacing w:before="0" w:after="80"/>
+      </w:pPr>
+      <w:r>
+        <w:t>The condition is exactly as requested: age greater than 18 is eligible; age 18 or below is not eligible.</w:t>
+      </w:r>
+    </w:p>
+    <w:p>
+      <w:pPr>
+        <w:pStyle w:val="Heading2"/>
+        <w:spacing w:before="200" w:after="80"/>
+      </w:pPr>
+      <w:r>
+        <w:t>Step 9 — Common mistakes</w:t>
+      </w:r>
+    </w:p>
+    <w:p>
+      <w:pPr>
+        <w:pStyle w:val="ListBullet"/>
+        <w:spacing w:before="0" w:after="40"/>
+      </w:pPr>
+      <w:r>
+        <w:rPr>
+          <w:b/>
+        </w:rPr>
+        <w:t>404 Not Found:</w:t>
+      </w:r>
+      <w:r>
+        <w:t xml:space="preserve"> Verify the application folder name, compilation output, and @WebServlet("/vote").</w:t>
+      </w:r>
+    </w:p>
+    <w:p>
+      <w:pPr>
+        <w:pStyle w:val="ListBullet"/>
+        <w:spacing w:before="0" w:after="40"/>
+      </w:pPr>
+      <w:r>
+        <w:rPr>
+          <w:b/>
+        </w:rPr>
+        <w:t>405 Method Not Allowed:</w:t>
+      </w:r>
+      <w:r>
+        <w:t xml:space="preserve"> The form must use method="post" because the servlet implements doPost().</w:t>
+      </w:r>
+    </w:p>
+    <w:p>
+      <w:pPr>
+        <w:pStyle w:val="ListBullet"/>
+        <w:spacing w:before="0" w:after="40"/>
+      </w:pPr>
+      <w:r>
+        <w:rPr>
+          <w:b/>
+        </w:rPr>
+        <w:t>Compile error:</w:t>
+      </w:r>
+      <w:r>
+        <w:t xml:space="preserve"> Run javac from the voting-servlet folder and check that ../../lib/* points to Tomcat's lib folder.</w:t>
+      </w:r>
+    </w:p>
+    <w:p>
+      <w:pPr>
+        <w:pStyle w:val="ListBullet"/>
+        <w:spacing w:before="0" w:after="40"/>
+      </w:pPr>
+      <w:r>
+        <w:rPr>
+          <w:b/>
+        </w:rPr>
+        <w:t>Cannot connect to localhost:8080:</w:t>
+      </w:r>
+      <w:r>
+        <w:t xml:space="preserve"> Check whether Tomcat is running and whether another application occupies port 8080.</w:t>
+      </w:r>
+    </w:p>
+    <w:p>
+      <w:pPr>
+        <w:pStyle w:val="ListBullet"/>
+        <w:spacing w:before="0" w:after="40"/>
+      </w:pPr>
+      <w:r>
+        <w:rPr>
+          <w:b/>
+        </w:rPr>
+        <w:t>Tomcat 9:</w:t>
+      </w:r>
+      <w:r>
+        <w:t xml:space="preserve"> Use javax.servlet imports, not jakarta.servlet imports.</w:t>
+      </w:r>
+    </w:p>
+    <w:p>
+      <w:pPr>
+        <w:pStyle w:val="Heading2"/>
+        <w:spacing w:before="200" w:after="80"/>
+      </w:pPr>
+      <w:r>
+        <w:t>One-minute memory sheet</w:t>
+      </w:r>
+    </w:p>
+    <w:tbl>
+      <w:tblPr>
+        <w:tblW w:type="auto" w:w="0"/>
+        <w:tblLayout w:type="fixed"/>
+        <w:tblLook w:firstColumn="1" w:firstRow="1" w:lastColumn="0" w:lastRow="0" w:noHBand="0" w:noVBand="1" w:val="04A0"/>
+      </w:tblPr>
+      <w:tblGrid>
+        <w:gridCol w:w="10080"/>
+      </w:tblGrid>
+      <w:tr>
+        <w:tc>
+          <w:tcPr>
+            <w:tcW w:type="dxa" w:w="10080"/>
+            <w:shd w:fill="F6F8FA"/>
+            <w:tcBorders>
+              <w:top w:val="single" w:sz="4" w:space="0" w:color="D0D7DE"/>
+              <w:left w:val="single" w:sz="4" w:space="0" w:color="D0D7DE"/>
+              <w:bottom w:val="single" w:sz="4" w:space="0" w:color="D0D7DE"/>
+              <w:right w:val="single" w:sz="4" w:space="0" w:color="D0D7DE"/>
+            </w:tcBorders>
+            <w:tcMar>
+              <w:top w:w="120" w:type="dxa"/>
+              <w:left w:w="180" w:type="dxa"/>
+              <w:bottom w:w="120" w:type="dxa"/>
+              <w:right w:w="180" w:type="dxa"/>
+            </w:tcMar>
+          </w:tcPr>
+          <w:p>
+            <w:pPr>
+              <w:spacing w:before="0" w:after="0" w:line="252" w:lineRule="auto"/>
+            </w:pPr>
+            <w:r>
+              <w:rPr>
+                <w:rFonts w:ascii="Consolas" w:hAnsi="Consolas"/>
+                <w:color w:val="24292F"/>
+                <w:sz w:val="17"/>
+              </w:rPr>
+              <w:t>1. cd &lt;tomcat-root&gt;</w:t>
+              <w:br/>
+              <w:t>2. mkdir -p webapps/voting-servlet/WEB-INF/classes</w:t>
+              <w:br/>
+              <w:t>3. cd webapps/voting-servlet</w:t>
+              <w:br/>
+              <w:t>4. nano index.html</w:t>
+              <w:br/>
+              <w:t>5. nano VoteServlet.java</w:t>
+              <w:br/>
+              <w:t>6. javac -cp "../../lib/*" -d WEB-INF/classes VoteServlet.java</w:t>
+              <w:br/>
+              <w:t>7. ls WEB-INF/classes/com</w:t>
+              <w:br/>
+              <w:t>8. cd &lt;tomcat-root&gt;</w:t>
+              <w:br/>
+              <w:t>9. ./bin/startup.sh</w:t>
+              <w:br/>
+              <w:t>10. Open http://localhost:8080/voting-servlet/</w:t>
+            </w:r>
+          </w:p>
+        </w:tc>
+      </w:tr>
+    </w:tbl>
+    <w:p>
+      <w:pPr>
+        <w:spacing w:before="0" w:after="120"/>
+      </w:pPr>
+    </w:p>
+    <w:p>
+      <w:pPr>
+        <w:spacing w:before="0" w:after="80"/>
+      </w:pPr>
+      <w:r>
+        <w:t>Remember: HTML form → POST /vote → @WebServlet("/vote") → VoteServlet.doPost() → display name, age, and voting eligibility.</w:t>
+      </w:r>
+    </w:p>
     <w:sectPr>
       <w:pgSz w:w="12240" w:h="15840"/>
       <w:pgMar w:top="1080" w:right="1080" w:bottom="1080" w:left="1080" w:header="720" w:footer="720" w:gutter="0"/>

</xml_diff>